<commit_message>
Projektni zadatak 1, finalizirano
</commit_message>
<xml_diff>
--- a/Z1/PZ1/OIS - z1.docx
+++ b/Z1/PZ1/OIS - z1.docx
@@ -13,6 +13,7 @@
       <w:r>
         <w:rPr>
           <w:rFonts w:ascii="Times New Roman" w:hAnsi="Times New Roman" w:cs="Times New Roman"/>
+          <w:noProof/>
         </w:rPr>
         <w:drawing>
           <wp:inline distT="0" distB="0" distL="0" distR="0" wp14:anchorId="23B14088" wp14:editId="6205612C">
@@ -259,25 +260,7 @@
         <w:rPr>
           <w:rFonts w:ascii="Times New Roman" w:hAnsi="Times New Roman" w:cs="Times New Roman"/>
         </w:rPr>
-        <w:t xml:space="preserve">Članovi: </w:t>
-      </w:r>
-      <w:r>
-        <w:rPr>
-          <w:rFonts w:ascii="Times New Roman" w:hAnsi="Times New Roman" w:cs="Times New Roman"/>
-        </w:rPr>
-        <w:t>Azra Trako, Merima Smajić, Iman Bakić, Nejla Bibić, Ajla Hasanbegović, Lamija Maglić</w:t>
-      </w:r>
-      <w:r>
-        <w:rPr>
-          <w:rFonts w:ascii="Times New Roman" w:hAnsi="Times New Roman" w:cs="Times New Roman"/>
-        </w:rPr>
-        <w:t xml:space="preserve">, </w:t>
-      </w:r>
-      <w:r>
-        <w:rPr>
-          <w:rFonts w:ascii="Times New Roman" w:hAnsi="Times New Roman" w:cs="Times New Roman"/>
-        </w:rPr>
-        <w:t>Tahira Ibrišević, Sendin Pašović, Muhamed Muslibegović, Mubarak Appa Bugis</w:t>
+        <w:t>Članovi: Azra Trako, Merima Smajić, Iman Bakić, Nejla Bibić, Ajla Hasanbegović, Lamija Maglić, Tahira Ibrišević, Sendin Pašović, Muhamed Muslibegović, Mubarak Appa Bugis</w:t>
       </w:r>
     </w:p>
     <w:p>
@@ -339,10 +322,13 @@
     <w:sdt>
       <w:sdtPr>
         <w:rPr>
-          <w:rFonts w:ascii="Times New Roman" w:hAnsi="Times New Roman" w:cs="Times New Roman"/>
+          <w:rFonts w:ascii="Times New Roman" w:eastAsiaTheme="minorHAnsi" w:hAnsi="Times New Roman" w:cs="Times New Roman"/>
+          <w:color w:val="auto"/>
+          <w:kern w:val="2"/>
           <w:sz w:val="20"/>
           <w:szCs w:val="20"/>
           <w:lang w:val="bs-Latn-BA"/>
+          <w14:ligatures w14:val="standardContextual"/>
         </w:rPr>
         <w:id w:val="-958417340"/>
         <w:docPartObj>
@@ -352,14 +338,10 @@
       </w:sdtPr>
       <w:sdtEndPr>
         <w:rPr>
-          <w:rFonts w:eastAsiaTheme="minorHAnsi"/>
           <w:b/>
           <w:bCs/>
-          <w:color w:val="auto"/>
-          <w:kern w:val="2"/>
           <w:sz w:val="24"/>
           <w:szCs w:val="24"/>
-          <w14:ligatures w14:val="standardContextual"/>
         </w:rPr>
       </w:sdtEndPr>
       <w:sdtContent>
@@ -3786,7 +3768,7 @@
                 <w:sz w:val="20"/>
                 <w:szCs w:val="20"/>
               </w:rPr>
-              <w:t>21</w:t>
+              <w:t>22</w:t>
             </w:r>
             <w:r>
               <w:rPr>
@@ -3907,7 +3889,7 @@
                 <w:sz w:val="20"/>
                 <w:szCs w:val="20"/>
               </w:rPr>
-              <w:t>22</w:t>
+              <w:t>23</w:t>
             </w:r>
             <w:r>
               <w:rPr>
@@ -4028,7 +4010,7 @@
                 <w:sz w:val="20"/>
                 <w:szCs w:val="20"/>
               </w:rPr>
-              <w:t>22</w:t>
+              <w:t>23</w:t>
             </w:r>
             <w:r>
               <w:rPr>
@@ -4149,7 +4131,7 @@
                 <w:sz w:val="20"/>
                 <w:szCs w:val="20"/>
               </w:rPr>
-              <w:t>22</w:t>
+              <w:t>23</w:t>
             </w:r>
             <w:r>
               <w:rPr>
@@ -4270,7 +4252,7 @@
                 <w:sz w:val="20"/>
                 <w:szCs w:val="20"/>
               </w:rPr>
-              <w:t>24</w:t>
+              <w:t>25</w:t>
             </w:r>
             <w:r>
               <w:rPr>
@@ -4391,7 +4373,7 @@
                 <w:sz w:val="20"/>
                 <w:szCs w:val="20"/>
               </w:rPr>
-              <w:t>24</w:t>
+              <w:t>25</w:t>
             </w:r>
             <w:r>
               <w:rPr>
@@ -4512,7 +4494,7 @@
                 <w:sz w:val="20"/>
                 <w:szCs w:val="20"/>
               </w:rPr>
-              <w:t>25</w:t>
+              <w:t>26</w:t>
             </w:r>
             <w:r>
               <w:rPr>
@@ -4633,7 +4615,7 @@
                 <w:sz w:val="20"/>
                 <w:szCs w:val="20"/>
               </w:rPr>
-              <w:t>25</w:t>
+              <w:t>29</w:t>
             </w:r>
             <w:r>
               <w:rPr>
@@ -4754,7 +4736,7 @@
                 <w:sz w:val="20"/>
                 <w:szCs w:val="20"/>
               </w:rPr>
-              <w:t>25</w:t>
+              <w:t>29</w:t>
             </w:r>
             <w:r>
               <w:rPr>
@@ -4875,7 +4857,7 @@
                 <w:sz w:val="20"/>
                 <w:szCs w:val="20"/>
               </w:rPr>
-              <w:t>26</w:t>
+              <w:t>29</w:t>
             </w:r>
             <w:r>
               <w:rPr>
@@ -4996,7 +4978,7 @@
                 <w:sz w:val="20"/>
                 <w:szCs w:val="20"/>
               </w:rPr>
-              <w:t>26</w:t>
+              <w:t>29</w:t>
             </w:r>
             <w:r>
               <w:rPr>
@@ -5117,7 +5099,7 @@
                 <w:sz w:val="20"/>
                 <w:szCs w:val="20"/>
               </w:rPr>
-              <w:t>26</w:t>
+              <w:t>30</w:t>
             </w:r>
             <w:r>
               <w:rPr>
@@ -5238,7 +5220,7 @@
                 <w:sz w:val="20"/>
                 <w:szCs w:val="20"/>
               </w:rPr>
-              <w:t>27</w:t>
+              <w:t>30</w:t>
             </w:r>
             <w:r>
               <w:rPr>
@@ -5359,7 +5341,7 @@
                 <w:sz w:val="20"/>
                 <w:szCs w:val="20"/>
               </w:rPr>
-              <w:t>27</w:t>
+              <w:t>30</w:t>
             </w:r>
             <w:r>
               <w:rPr>
@@ -5480,7 +5462,7 @@
                 <w:sz w:val="20"/>
                 <w:szCs w:val="20"/>
               </w:rPr>
-              <w:t>28</w:t>
+              <w:t>31</w:t>
             </w:r>
             <w:r>
               <w:rPr>
@@ -5601,7 +5583,7 @@
                 <w:sz w:val="20"/>
                 <w:szCs w:val="20"/>
               </w:rPr>
-              <w:t>28</w:t>
+              <w:t>31</w:t>
             </w:r>
             <w:r>
               <w:rPr>
@@ -5722,7 +5704,7 @@
                 <w:sz w:val="20"/>
                 <w:szCs w:val="20"/>
               </w:rPr>
-              <w:t>28</w:t>
+              <w:t>32</w:t>
             </w:r>
             <w:r>
               <w:rPr>
@@ -5820,7 +5802,7 @@
                 <w:sz w:val="20"/>
                 <w:szCs w:val="20"/>
               </w:rPr>
-              <w:t>28</w:t>
+              <w:t>32</w:t>
             </w:r>
             <w:r>
               <w:rPr>
@@ -5941,7 +5923,7 @@
                 <w:sz w:val="20"/>
                 <w:szCs w:val="20"/>
               </w:rPr>
-              <w:t>29</w:t>
+              <w:t>32</w:t>
             </w:r>
             <w:r>
               <w:rPr>
@@ -6062,7 +6044,7 @@
                 <w:sz w:val="20"/>
                 <w:szCs w:val="20"/>
               </w:rPr>
-              <w:t>29</w:t>
+              <w:t>33</w:t>
             </w:r>
             <w:r>
               <w:rPr>
@@ -6183,7 +6165,7 @@
                 <w:sz w:val="20"/>
                 <w:szCs w:val="20"/>
               </w:rPr>
-              <w:t>30</w:t>
+              <w:t>33</w:t>
             </w:r>
             <w:r>
               <w:rPr>
@@ -6304,7 +6286,7 @@
                 <w:sz w:val="20"/>
                 <w:szCs w:val="20"/>
               </w:rPr>
-              <w:t>31</w:t>
+              <w:t>34</w:t>
             </w:r>
             <w:r>
               <w:rPr>
@@ -6425,7 +6407,7 @@
                 <w:sz w:val="20"/>
                 <w:szCs w:val="20"/>
               </w:rPr>
-              <w:t>31</w:t>
+              <w:t>34</w:t>
             </w:r>
             <w:r>
               <w:rPr>
@@ -6546,7 +6528,7 @@
                 <w:sz w:val="20"/>
                 <w:szCs w:val="20"/>
               </w:rPr>
-              <w:t>31</w:t>
+              <w:t>34</w:t>
             </w:r>
             <w:r>
               <w:rPr>
@@ -6667,7 +6649,7 @@
                 <w:sz w:val="20"/>
                 <w:szCs w:val="20"/>
               </w:rPr>
-              <w:t>32</w:t>
+              <w:t>35</w:t>
             </w:r>
             <w:r>
               <w:rPr>
@@ -6788,7 +6770,7 @@
                 <w:sz w:val="20"/>
                 <w:szCs w:val="20"/>
               </w:rPr>
-              <w:t>33</w:t>
+              <w:t>37</w:t>
             </w:r>
             <w:r>
               <w:rPr>
@@ -6909,7 +6891,7 @@
                 <w:sz w:val="20"/>
                 <w:szCs w:val="20"/>
               </w:rPr>
-              <w:t>34</w:t>
+              <w:t>37</w:t>
             </w:r>
             <w:r>
               <w:rPr>
@@ -7030,7 +7012,7 @@
                 <w:sz w:val="20"/>
                 <w:szCs w:val="20"/>
               </w:rPr>
-              <w:t>34</w:t>
+              <w:t>38</w:t>
             </w:r>
             <w:r>
               <w:rPr>
@@ -7151,7 +7133,7 @@
                 <w:sz w:val="20"/>
                 <w:szCs w:val="20"/>
               </w:rPr>
-              <w:t>34</w:t>
+              <w:t>38</w:t>
             </w:r>
             <w:r>
               <w:rPr>
@@ -7272,7 +7254,7 @@
                 <w:sz w:val="20"/>
                 <w:szCs w:val="20"/>
               </w:rPr>
-              <w:t>35</w:t>
+              <w:t>38</w:t>
             </w:r>
             <w:r>
               <w:rPr>
@@ -7393,7 +7375,7 @@
                 <w:sz w:val="20"/>
                 <w:szCs w:val="20"/>
               </w:rPr>
-              <w:t>36</w:t>
+              <w:t>39</w:t>
             </w:r>
             <w:r>
               <w:rPr>
@@ -7514,7 +7496,7 @@
                 <w:sz w:val="20"/>
                 <w:szCs w:val="20"/>
               </w:rPr>
-              <w:t>36</w:t>
+              <w:t>39</w:t>
             </w:r>
             <w:r>
               <w:rPr>
@@ -7635,7 +7617,7 @@
                 <w:sz w:val="20"/>
                 <w:szCs w:val="20"/>
               </w:rPr>
-              <w:t>37</w:t>
+              <w:t>40</w:t>
             </w:r>
             <w:r>
               <w:rPr>
@@ -7756,7 +7738,7 @@
                 <w:sz w:val="20"/>
                 <w:szCs w:val="20"/>
               </w:rPr>
-              <w:t>38</w:t>
+              <w:t>41</w:t>
             </w:r>
             <w:r>
               <w:rPr>
@@ -7877,7 +7859,7 @@
                 <w:sz w:val="20"/>
                 <w:szCs w:val="20"/>
               </w:rPr>
-              <w:t>39</w:t>
+              <w:t>42</w:t>
             </w:r>
             <w:r>
               <w:rPr>
@@ -7998,7 +7980,7 @@
                 <w:sz w:val="20"/>
                 <w:szCs w:val="20"/>
               </w:rPr>
-              <w:t>39</w:t>
+              <w:t>42</w:t>
             </w:r>
             <w:r>
               <w:rPr>
@@ -8119,7 +8101,7 @@
                 <w:sz w:val="20"/>
                 <w:szCs w:val="20"/>
               </w:rPr>
-              <w:t>39</w:t>
+              <w:t>43</w:t>
             </w:r>
             <w:r>
               <w:rPr>
@@ -8240,7 +8222,7 @@
                 <w:sz w:val="20"/>
                 <w:szCs w:val="20"/>
               </w:rPr>
-              <w:t>41</w:t>
+              <w:t>44</w:t>
             </w:r>
             <w:r>
               <w:rPr>
@@ -8361,7 +8343,7 @@
                 <w:sz w:val="20"/>
                 <w:szCs w:val="20"/>
               </w:rPr>
-              <w:t>43</w:t>
+              <w:t>46</w:t>
             </w:r>
             <w:r>
               <w:rPr>
@@ -8482,7 +8464,7 @@
                 <w:sz w:val="20"/>
                 <w:szCs w:val="20"/>
               </w:rPr>
-              <w:t>45</w:t>
+              <w:t>48</w:t>
             </w:r>
             <w:r>
               <w:rPr>
@@ -8603,7 +8585,7 @@
                 <w:sz w:val="20"/>
                 <w:szCs w:val="20"/>
               </w:rPr>
-              <w:t>46</w:t>
+              <w:t>49</w:t>
             </w:r>
             <w:r>
               <w:rPr>
@@ -8724,7 +8706,7 @@
                 <w:sz w:val="20"/>
                 <w:szCs w:val="20"/>
               </w:rPr>
-              <w:t>46</w:t>
+              <w:t>50</w:t>
             </w:r>
             <w:r>
               <w:rPr>
@@ -8845,7 +8827,7 @@
                 <w:sz w:val="20"/>
                 <w:szCs w:val="20"/>
               </w:rPr>
-              <w:t>46</w:t>
+              <w:t>50</w:t>
             </w:r>
             <w:r>
               <w:rPr>
@@ -8966,7 +8948,7 @@
                 <w:sz w:val="20"/>
                 <w:szCs w:val="20"/>
               </w:rPr>
-              <w:t>47</w:t>
+              <w:t>50</w:t>
             </w:r>
             <w:r>
               <w:rPr>
@@ -9087,7 +9069,7 @@
                 <w:sz w:val="20"/>
                 <w:szCs w:val="20"/>
               </w:rPr>
-              <w:t>48</w:t>
+              <w:t>51</w:t>
             </w:r>
             <w:r>
               <w:rPr>
@@ -9208,7 +9190,7 @@
                 <w:sz w:val="20"/>
                 <w:szCs w:val="20"/>
               </w:rPr>
-              <w:t>49</w:t>
+              <w:t>52</w:t>
             </w:r>
             <w:r>
               <w:rPr>
@@ -9329,7 +9311,7 @@
                 <w:sz w:val="20"/>
                 <w:szCs w:val="20"/>
               </w:rPr>
-              <w:t>49</w:t>
+              <w:t>53</w:t>
             </w:r>
             <w:r>
               <w:rPr>
@@ -9450,7 +9432,7 @@
                 <w:sz w:val="20"/>
                 <w:szCs w:val="20"/>
               </w:rPr>
-              <w:t>50</w:t>
+              <w:t>53</w:t>
             </w:r>
             <w:r>
               <w:rPr>
@@ -9571,7 +9553,7 @@
                 <w:sz w:val="20"/>
                 <w:szCs w:val="20"/>
               </w:rPr>
-              <w:t>50</w:t>
+              <w:t>54</w:t>
             </w:r>
             <w:r>
               <w:rPr>
@@ -9692,7 +9674,7 @@
                 <w:sz w:val="20"/>
                 <w:szCs w:val="20"/>
               </w:rPr>
-              <w:t>51</w:t>
+              <w:t>54</w:t>
             </w:r>
             <w:r>
               <w:rPr>
@@ -9813,7 +9795,7 @@
                 <w:sz w:val="20"/>
                 <w:szCs w:val="20"/>
               </w:rPr>
-              <w:t>52</w:t>
+              <w:t>55</w:t>
             </w:r>
             <w:r>
               <w:rPr>
@@ -9934,7 +9916,7 @@
                 <w:sz w:val="20"/>
                 <w:szCs w:val="20"/>
               </w:rPr>
-              <w:t>52</w:t>
+              <w:t>56</w:t>
             </w:r>
             <w:r>
               <w:rPr>
@@ -10055,7 +10037,7 @@
                 <w:sz w:val="20"/>
                 <w:szCs w:val="20"/>
               </w:rPr>
-              <w:t>52</w:t>
+              <w:t>56</w:t>
             </w:r>
             <w:r>
               <w:rPr>
@@ -10176,7 +10158,7 @@
                 <w:sz w:val="20"/>
                 <w:szCs w:val="20"/>
               </w:rPr>
-              <w:t>52</w:t>
+              <w:t>56</w:t>
             </w:r>
             <w:r>
               <w:rPr>
@@ -10297,7 +10279,7 @@
                 <w:sz w:val="20"/>
                 <w:szCs w:val="20"/>
               </w:rPr>
-              <w:t>53</w:t>
+              <w:t>57</w:t>
             </w:r>
             <w:r>
               <w:rPr>
@@ -10418,7 +10400,7 @@
                 <w:sz w:val="20"/>
                 <w:szCs w:val="20"/>
               </w:rPr>
-              <w:t>55</w:t>
+              <w:t>59</w:t>
             </w:r>
             <w:r>
               <w:rPr>
@@ -10468,6 +10450,7 @@
           <w:lang w:val="bs-Latn-BA"/>
         </w:rPr>
       </w:pPr>
+      <w:proofErr w:type="spellStart"/>
       <w:r>
         <w:rPr>
           <w:rFonts w:ascii="Times New Roman" w:hAnsi="Times New Roman" w:cs="Times New Roman"/>
@@ -10476,8 +10459,31 @@
           <w:sz w:val="24"/>
           <w:szCs w:val="24"/>
         </w:rPr>
-        <w:t>Popis tabela</w:t>
-      </w:r>
+        <w:t>Popis</w:t>
+      </w:r>
+      <w:proofErr w:type="spellEnd"/>
+      <w:r>
+        <w:rPr>
+          <w:rFonts w:ascii="Times New Roman" w:hAnsi="Times New Roman" w:cs="Times New Roman"/>
+          <w:b/>
+          <w:bCs/>
+          <w:sz w:val="24"/>
+          <w:szCs w:val="24"/>
+        </w:rPr>
+        <w:t xml:space="preserve"> </w:t>
+      </w:r>
+      <w:proofErr w:type="spellStart"/>
+      <w:r>
+        <w:rPr>
+          <w:rFonts w:ascii="Times New Roman" w:hAnsi="Times New Roman" w:cs="Times New Roman"/>
+          <w:b/>
+          <w:bCs/>
+          <w:sz w:val="24"/>
+          <w:szCs w:val="24"/>
+        </w:rPr>
+        <w:t>tabela</w:t>
+      </w:r>
+      <w:proofErr w:type="spellEnd"/>
     </w:p>
     <w:p>
       <w:pPr>
@@ -10964,7 +10970,7 @@
             <w:sz w:val="20"/>
             <w:szCs w:val="20"/>
           </w:rPr>
-          <w:t>40</w:t>
+          <w:t>43</w:t>
         </w:r>
         <w:r>
           <w:rPr>
@@ -11059,7 +11065,7 @@
             <w:sz w:val="20"/>
             <w:szCs w:val="20"/>
           </w:rPr>
-          <w:t>41</w:t>
+          <w:t>44</w:t>
         </w:r>
         <w:r>
           <w:rPr>
@@ -11154,7 +11160,7 @@
             <w:sz w:val="20"/>
             <w:szCs w:val="20"/>
           </w:rPr>
-          <w:t>42</w:t>
+          <w:t>45</w:t>
         </w:r>
         <w:r>
           <w:rPr>
@@ -11249,7 +11255,7 @@
             <w:sz w:val="20"/>
             <w:szCs w:val="20"/>
           </w:rPr>
-          <w:t>43</w:t>
+          <w:t>46</w:t>
         </w:r>
         <w:r>
           <w:rPr>
@@ -11344,7 +11350,7 @@
             <w:sz w:val="20"/>
             <w:szCs w:val="20"/>
           </w:rPr>
-          <w:t>45</w:t>
+          <w:t>48</w:t>
         </w:r>
         <w:r>
           <w:rPr>
@@ -11439,7 +11445,7 @@
             <w:sz w:val="20"/>
             <w:szCs w:val="20"/>
           </w:rPr>
-          <w:t>47</w:t>
+          <w:t>51</w:t>
         </w:r>
         <w:r>
           <w:rPr>
@@ -11534,7 +11540,7 @@
             <w:sz w:val="20"/>
             <w:szCs w:val="20"/>
           </w:rPr>
-          <w:t>49</w:t>
+          <w:t>53</w:t>
         </w:r>
         <w:r>
           <w:rPr>
@@ -11629,7 +11635,7 @@
             <w:sz w:val="20"/>
             <w:szCs w:val="20"/>
           </w:rPr>
-          <w:t>52</w:t>
+          <w:t>55</w:t>
         </w:r>
         <w:r>
           <w:rPr>
@@ -11714,18 +11720,12 @@
           <w:tab w:val="right" w:leader="dot" w:pos="9350"/>
         </w:tabs>
         <w:rPr>
-          <w:rStyle w:val="Hyperlink"/>
-          <w:rFonts w:ascii="Times New Roman" w:hAnsi="Times New Roman" w:cs="Times New Roman"/>
+          <w:rFonts w:ascii="Times New Roman" w:eastAsiaTheme="minorEastAsia" w:hAnsi="Times New Roman" w:cs="Times New Roman"/>
           <w:noProof/>
           <w:sz w:val="20"/>
           <w:szCs w:val="20"/>
-        </w:rPr>
-        <w:sectPr>
-          <w:pgSz w:w="12240" w:h="15840"/>
-          <w:pgMar w:top="1440" w:right="1440" w:bottom="1440" w:left="1440" w:header="720" w:footer="720" w:gutter="0"/>
-          <w:cols w:space="720"/>
-          <w:docGrid w:linePitch="360"/>
-        </w:sectPr>
+          <w:lang w:val="en-US"/>
+        </w:rPr>
       </w:pPr>
       <w:r>
         <w:rPr>
@@ -11754,7 +11754,7 @@
         </w:rPr>
         <w:fldChar w:fldCharType="separate"/>
       </w:r>
-      <w:hyperlink w:anchor="_Toc243881273" w:history="1">
+      <w:hyperlink w:anchor="_Toc243929254" w:history="1">
         <w:r>
           <w:rPr>
             <w:rStyle w:val="Hyperlink"/>
@@ -11793,7 +11793,7 @@
             <w:sz w:val="20"/>
             <w:szCs w:val="20"/>
           </w:rPr>
-          <w:instrText xml:space="preserve"> PAGEREF _Toc243881273 \h </w:instrText>
+          <w:instrText xml:space="preserve"> PAGEREF _Toc243929254 \h </w:instrText>
         </w:r>
         <w:r>
           <w:rPr>
@@ -11822,7 +11822,206 @@
             <w:sz w:val="20"/>
             <w:szCs w:val="20"/>
           </w:rPr>
-          <w:t>7</w:t>
+          <w:t>10</w:t>
+        </w:r>
+        <w:r>
+          <w:rPr>
+            <w:rFonts w:ascii="Times New Roman" w:hAnsi="Times New Roman" w:cs="Times New Roman"/>
+            <w:noProof/>
+            <w:webHidden/>
+            <w:sz w:val="20"/>
+            <w:szCs w:val="20"/>
+          </w:rPr>
+          <w:fldChar w:fldCharType="end"/>
+        </w:r>
+      </w:hyperlink>
+    </w:p>
+    <w:p>
+      <w:pPr>
+        <w:pStyle w:val="TableofFigures"/>
+        <w:tabs>
+          <w:tab w:val="right" w:leader="dot" w:pos="9350"/>
+        </w:tabs>
+        <w:rPr>
+          <w:rFonts w:ascii="Times New Roman" w:eastAsiaTheme="minorEastAsia" w:hAnsi="Times New Roman" w:cs="Times New Roman"/>
+          <w:noProof/>
+          <w:sz w:val="20"/>
+          <w:szCs w:val="20"/>
+          <w:lang w:val="en-US"/>
+        </w:rPr>
+      </w:pPr>
+      <w:hyperlink w:anchor="_Toc243929255" w:history="1">
+        <w:r>
+          <w:rPr>
+            <w:rStyle w:val="Hyperlink"/>
+            <w:rFonts w:ascii="Times New Roman" w:hAnsi="Times New Roman" w:cs="Times New Roman"/>
+            <w:noProof/>
+            <w:sz w:val="20"/>
+            <w:szCs w:val="20"/>
+          </w:rPr>
+          <w:t>Slika 2: AS-IS model postojećeg poslovnog procesa tehničkih inspekcija dronovima</w:t>
+        </w:r>
+        <w:r>
+          <w:rPr>
+            <w:rFonts w:ascii="Times New Roman" w:hAnsi="Times New Roman" w:cs="Times New Roman"/>
+            <w:noProof/>
+            <w:webHidden/>
+            <w:sz w:val="20"/>
+            <w:szCs w:val="20"/>
+          </w:rPr>
+          <w:tab/>
+        </w:r>
+        <w:r>
+          <w:rPr>
+            <w:rFonts w:ascii="Times New Roman" w:hAnsi="Times New Roman" w:cs="Times New Roman"/>
+            <w:noProof/>
+            <w:webHidden/>
+            <w:sz w:val="20"/>
+            <w:szCs w:val="20"/>
+          </w:rPr>
+          <w:fldChar w:fldCharType="begin"/>
+        </w:r>
+        <w:r>
+          <w:rPr>
+            <w:rFonts w:ascii="Times New Roman" w:hAnsi="Times New Roman" w:cs="Times New Roman"/>
+            <w:noProof/>
+            <w:webHidden/>
+            <w:sz w:val="20"/>
+            <w:szCs w:val="20"/>
+          </w:rPr>
+          <w:instrText xml:space="preserve"> PAGEREF _Toc243929255 \h </w:instrText>
+        </w:r>
+        <w:r>
+          <w:rPr>
+            <w:rFonts w:ascii="Times New Roman" w:hAnsi="Times New Roman" w:cs="Times New Roman"/>
+            <w:noProof/>
+            <w:webHidden/>
+            <w:sz w:val="20"/>
+            <w:szCs w:val="20"/>
+          </w:rPr>
+        </w:r>
+        <w:r>
+          <w:rPr>
+            <w:rFonts w:ascii="Times New Roman" w:hAnsi="Times New Roman" w:cs="Times New Roman"/>
+            <w:noProof/>
+            <w:webHidden/>
+            <w:sz w:val="20"/>
+            <w:szCs w:val="20"/>
+          </w:rPr>
+          <w:fldChar w:fldCharType="separate"/>
+        </w:r>
+        <w:r>
+          <w:rPr>
+            <w:rFonts w:ascii="Times New Roman" w:hAnsi="Times New Roman" w:cs="Times New Roman"/>
+            <w:noProof/>
+            <w:webHidden/>
+            <w:sz w:val="20"/>
+            <w:szCs w:val="20"/>
+          </w:rPr>
+          <w:t>25</w:t>
+        </w:r>
+        <w:r>
+          <w:rPr>
+            <w:rFonts w:ascii="Times New Roman" w:hAnsi="Times New Roman" w:cs="Times New Roman"/>
+            <w:noProof/>
+            <w:webHidden/>
+            <w:sz w:val="20"/>
+            <w:szCs w:val="20"/>
+          </w:rPr>
+          <w:fldChar w:fldCharType="end"/>
+        </w:r>
+      </w:hyperlink>
+    </w:p>
+    <w:p>
+      <w:pPr>
+        <w:pStyle w:val="TableofFigures"/>
+        <w:tabs>
+          <w:tab w:val="right" w:leader="dot" w:pos="9350"/>
+        </w:tabs>
+        <w:rPr>
+          <w:rStyle w:val="Hyperlink"/>
+          <w:rFonts w:ascii="Times New Roman" w:hAnsi="Times New Roman" w:cs="Times New Roman"/>
+          <w:noProof/>
+          <w:sz w:val="20"/>
+          <w:szCs w:val="20"/>
+        </w:rPr>
+        <w:sectPr>
+          <w:pgSz w:w="12240" w:h="15840"/>
+          <w:pgMar w:top="1440" w:right="1440" w:bottom="1440" w:left="1440" w:header="720" w:footer="720" w:gutter="0"/>
+          <w:pgNumType w:start="1"/>
+          <w:cols w:space="720"/>
+          <w:docGrid w:linePitch="360"/>
+        </w:sectPr>
+      </w:pPr>
+      <w:hyperlink w:anchor="_Toc243929256" w:history="1">
+        <w:r>
+          <w:rPr>
+            <w:rStyle w:val="Hyperlink"/>
+            <w:rFonts w:ascii="Times New Roman" w:hAnsi="Times New Roman" w:cs="Times New Roman"/>
+            <w:noProof/>
+            <w:sz w:val="20"/>
+            <w:szCs w:val="20"/>
+          </w:rPr>
+          <w:t>Slika 3: TO-BE model poslovnog procesa tehničke inspekcije korištenjem sistema DroneInspect</w:t>
+        </w:r>
+        <w:r>
+          <w:rPr>
+            <w:rFonts w:ascii="Times New Roman" w:hAnsi="Times New Roman" w:cs="Times New Roman"/>
+            <w:noProof/>
+            <w:webHidden/>
+            <w:sz w:val="20"/>
+            <w:szCs w:val="20"/>
+          </w:rPr>
+          <w:tab/>
+        </w:r>
+        <w:r>
+          <w:rPr>
+            <w:rFonts w:ascii="Times New Roman" w:hAnsi="Times New Roman" w:cs="Times New Roman"/>
+            <w:noProof/>
+            <w:webHidden/>
+            <w:sz w:val="20"/>
+            <w:szCs w:val="20"/>
+          </w:rPr>
+          <w:fldChar w:fldCharType="begin"/>
+        </w:r>
+        <w:r>
+          <w:rPr>
+            <w:rFonts w:ascii="Times New Roman" w:hAnsi="Times New Roman" w:cs="Times New Roman"/>
+            <w:noProof/>
+            <w:webHidden/>
+            <w:sz w:val="20"/>
+            <w:szCs w:val="20"/>
+          </w:rPr>
+          <w:instrText xml:space="preserve"> PAGEREF _Toc243929256 \h </w:instrText>
+        </w:r>
+        <w:r>
+          <w:rPr>
+            <w:rFonts w:ascii="Times New Roman" w:hAnsi="Times New Roman" w:cs="Times New Roman"/>
+            <w:noProof/>
+            <w:webHidden/>
+            <w:sz w:val="20"/>
+            <w:szCs w:val="20"/>
+          </w:rPr>
+        </w:r>
+        <w:r>
+          <w:rPr>
+            <w:rFonts w:ascii="Times New Roman" w:hAnsi="Times New Roman" w:cs="Times New Roman"/>
+            <w:noProof/>
+            <w:webHidden/>
+            <w:sz w:val="20"/>
+            <w:szCs w:val="20"/>
+          </w:rPr>
+          <w:fldChar w:fldCharType="separate"/>
+        </w:r>
+        <w:r>
+          <w:rPr>
+            <w:rFonts w:ascii="Times New Roman" w:hAnsi="Times New Roman" w:cs="Times New Roman"/>
+            <w:noProof/>
+            <w:webHidden/>
+            <w:sz w:val="20"/>
+            <w:szCs w:val="20"/>
+          </w:rPr>
+          <w:t>32</w:t>
         </w:r>
         <w:r>
           <w:rPr>
@@ -15041,6 +15240,7 @@
       </w:pPr>
       <w:r>
         <w:rPr>
+          <w:noProof/>
           <w:lang w:val="bs-Latn-BA"/>
         </w:rPr>
         <w:lastRenderedPageBreak/>
@@ -15089,7 +15289,7 @@
           <w:rFonts w:ascii="Times New Roman" w:hAnsi="Times New Roman" w:cs="Times New Roman"/>
         </w:rPr>
       </w:pPr>
-      <w:bookmarkStart w:id="12" w:name="_Toc243881273"/>
+      <w:bookmarkStart w:id="12" w:name="_Toc243929254"/>
       <w:r>
         <w:rPr>
           <w:rFonts w:ascii="Times New Roman" w:hAnsi="Times New Roman" w:cs="Times New Roman"/>
@@ -18370,14 +18570,40 @@
           <w:rStyle w:val="Strong"/>
           <w:lang w:val="bs-Latn-BA"/>
         </w:rPr>
-        <w:t xml:space="preserve">1. </w:t>
-      </w:r>
+        <w:t>1. Visoka moć i visok interes – blisko upravljanje</w:t>
+      </w:r>
+    </w:p>
+    <w:p>
+      <w:pPr>
+        <w:pStyle w:val="NormalWeb"/>
+        <w:spacing w:line="276" w:lineRule="auto"/>
+        <w:jc w:val="both"/>
+        <w:rPr>
+          <w:lang w:val="bs-Latn-BA"/>
+        </w:rPr>
+      </w:pPr>
+      <w:r>
+        <w:rPr>
+          <w:lang w:val="bs-Latn-BA"/>
+        </w:rPr>
+        <w:t>U ovu grupu svrstani su uprava kompanije, koordinator inspekcija, tehnički inspektor i projektni tim. Njihovo aktivno učešće važno je za donošenje odluka, definisanje zahtjeva i provjeru kvaliteta predloženog rješenja.</w:t>
+      </w:r>
+    </w:p>
+    <w:p>
+      <w:pPr>
+        <w:pStyle w:val="NormalWeb"/>
+        <w:spacing w:line="276" w:lineRule="auto"/>
+        <w:jc w:val="both"/>
+        <w:rPr>
+          <w:lang w:val="bs-Latn-BA"/>
+        </w:rPr>
+      </w:pPr>
       <w:r>
         <w:rPr>
           <w:rStyle w:val="Strong"/>
           <w:lang w:val="bs-Latn-BA"/>
         </w:rPr>
-        <w:t>Visoka moć i visok interes – blisko upravljanje</w:t>
+        <w:t>2. Visoka moć i nizak interes – održavanje zadovoljstva</w:t>
       </w:r>
     </w:p>
     <w:p>
@@ -18393,7 +18619,7 @@
         <w:rPr>
           <w:lang w:val="bs-Latn-BA"/>
         </w:rPr>
-        <w:t>U ovu grupu svrstani su uprava kompanije, koordinator inspekcija, tehnički inspektor i projektni tim. Njihovo aktivno učešće važno je za donošenje odluka, definisanje zahtjeva i provjeru kvaliteta predloženog rješenja.</w:t>
+        <w:t>U ovu grupu preliminarno su svrstana regulatorna i nadležna tijela. Potrebno je pratiti relevantne zahtjeve i osigurati usklađenost poslovanja, bez pretpostavke njihovog stalnog učešća u razvoju informacionog sistema.</w:t>
       </w:r>
     </w:p>
     <w:p>
@@ -18410,94 +18636,40 @@
           <w:rStyle w:val="Strong"/>
           <w:lang w:val="bs-Latn-BA"/>
         </w:rPr>
-        <w:t xml:space="preserve">2. </w:t>
-      </w:r>
+        <w:t>3. Srednja moć i visok ili srednji interes – redovno informisanje i konsultovanje</w:t>
+      </w:r>
+    </w:p>
+    <w:p>
+      <w:pPr>
+        <w:pStyle w:val="NormalWeb"/>
+        <w:spacing w:line="276" w:lineRule="auto"/>
+        <w:jc w:val="both"/>
+        <w:rPr>
+          <w:lang w:val="bs-Latn-BA"/>
+        </w:rPr>
+      </w:pPr>
+      <w:r>
+        <w:rPr>
+          <w:lang w:val="bs-Latn-BA"/>
+        </w:rPr>
+        <w:t>Ovoj grupi pripadaju operater drona, administrator sistema i klijenti. Njihova iskustva i povratne informacije važne su za oblikovanje praktičnih i jednostavnih funkcionalnosti.</w:t>
+      </w:r>
+    </w:p>
+    <w:p>
+      <w:pPr>
+        <w:pStyle w:val="NormalWeb"/>
+        <w:spacing w:line="276" w:lineRule="auto"/>
+        <w:jc w:val="both"/>
+        <w:rPr>
+          <w:lang w:val="bs-Latn-BA"/>
+        </w:rPr>
+      </w:pPr>
       <w:r>
         <w:rPr>
           <w:rStyle w:val="Strong"/>
           <w:lang w:val="bs-Latn-BA"/>
         </w:rPr>
-        <w:t>Visoka moć i nizak interes – održavanje zadovoljstva</w:t>
-      </w:r>
-    </w:p>
-    <w:p>
-      <w:pPr>
-        <w:pStyle w:val="NormalWeb"/>
-        <w:spacing w:line="276" w:lineRule="auto"/>
-        <w:jc w:val="both"/>
-        <w:rPr>
-          <w:lang w:val="bs-Latn-BA"/>
-        </w:rPr>
-      </w:pPr>
-      <w:r>
-        <w:rPr>
-          <w:lang w:val="bs-Latn-BA"/>
-        </w:rPr>
-        <w:t>U ovu grupu preliminarno su svrstana regulatorna i nadležna tijela. Potrebno je pratiti relevantne zahtjeve i osigurati usklađenost poslovanja, bez pretpostavke njihovog stalnog učešća u razvoju informacionog sistema.</w:t>
-      </w:r>
-    </w:p>
-    <w:p>
-      <w:pPr>
-        <w:pStyle w:val="NormalWeb"/>
-        <w:spacing w:line="276" w:lineRule="auto"/>
-        <w:jc w:val="both"/>
-        <w:rPr>
-          <w:lang w:val="bs-Latn-BA"/>
-        </w:rPr>
-      </w:pPr>
-      <w:r>
-        <w:rPr>
-          <w:rStyle w:val="Strong"/>
-          <w:lang w:val="bs-Latn-BA"/>
-        </w:rPr>
-        <w:t xml:space="preserve">3. </w:t>
-      </w:r>
-      <w:r>
-        <w:rPr>
-          <w:rStyle w:val="Strong"/>
-          <w:lang w:val="bs-Latn-BA"/>
-        </w:rPr>
-        <w:t>Srednja moć i visok ili srednji interes – redovno informisanje i konsultovanje</w:t>
-      </w:r>
-    </w:p>
-    <w:p>
-      <w:pPr>
-        <w:pStyle w:val="NormalWeb"/>
-        <w:spacing w:line="276" w:lineRule="auto"/>
-        <w:jc w:val="both"/>
-        <w:rPr>
-          <w:lang w:val="bs-Latn-BA"/>
-        </w:rPr>
-      </w:pPr>
-      <w:r>
-        <w:rPr>
-          <w:lang w:val="bs-Latn-BA"/>
-        </w:rPr>
-        <w:t>Ovoj grupi pripadaju operater drona, administrator sistema i klijenti. Njihova iskustva i povratne informacije važne su za oblikovanje praktičnih i jednostavnih funkcionalnosti.</w:t>
-      </w:r>
-    </w:p>
-    <w:p>
-      <w:pPr>
-        <w:pStyle w:val="NormalWeb"/>
-        <w:spacing w:line="276" w:lineRule="auto"/>
-        <w:jc w:val="both"/>
-        <w:rPr>
-          <w:lang w:val="bs-Latn-BA"/>
-        </w:rPr>
-      </w:pPr>
-      <w:r>
-        <w:rPr>
-          <w:rStyle w:val="Strong"/>
-          <w:lang w:val="bs-Latn-BA"/>
-        </w:rPr>
-        <w:t xml:space="preserve">4. </w:t>
-      </w:r>
-      <w:r>
-        <w:rPr>
-          <w:rStyle w:val="Strong"/>
-          <w:lang w:val="bs-Latn-BA"/>
-        </w:rPr>
-        <w:t xml:space="preserve">Niža </w:t>
+        <w:t xml:space="preserve">4. Niža </w:t>
       </w:r>
       <w:r>
         <w:rPr>
@@ -20284,6 +20456,144 @@
     </w:p>
     <w:p>
       <w:pPr>
+        <w:pStyle w:val="NormalWeb"/>
+        <w:keepNext/>
+        <w:spacing w:line="276" w:lineRule="auto"/>
+        <w:ind w:left="720"/>
+        <w:jc w:val="both"/>
+      </w:pPr>
+      <w:r>
+        <w:rPr>
+          <w:noProof/>
+        </w:rPr>
+        <w:lastRenderedPageBreak/>
+        <w:drawing>
+          <wp:inline distT="0" distB="0" distL="0" distR="0" wp14:anchorId="0551ED93" wp14:editId="26D26FB6">
+            <wp:extent cx="3948377" cy="7885108"/>
+            <wp:effectExtent l="0" t="0" r="0" b="1905"/>
+            <wp:docPr id="249318910" name="Picture 1"/>
+            <wp:cNvGraphicFramePr>
+              <a:graphicFrameLocks xmlns:a="http://schemas.openxmlformats.org/drawingml/2006/main" noChangeAspect="1"/>
+            </wp:cNvGraphicFramePr>
+            <a:graphic xmlns:a="http://schemas.openxmlformats.org/drawingml/2006/main">
+              <a:graphicData uri="http://schemas.openxmlformats.org/drawingml/2006/picture">
+                <pic:pic xmlns:pic="http://schemas.openxmlformats.org/drawingml/2006/picture">
+                  <pic:nvPicPr>
+                    <pic:cNvPr id="0" name="Picture 1"/>
+                    <pic:cNvPicPr>
+                      <a:picLocks noChangeAspect="1" noChangeArrowheads="1"/>
+                    </pic:cNvPicPr>
+                  </pic:nvPicPr>
+                  <pic:blipFill rotWithShape="1">
+                    <a:blip r:embed="rId10">
+                      <a:extLst>
+                        <a:ext uri="{28A0092B-C50C-407E-A947-70E740481C1C}">
+                          <a14:useLocalDpi xmlns:a14="http://schemas.microsoft.com/office/drawing/2010/main" val="0"/>
+                        </a:ext>
+                      </a:extLst>
+                    </a:blip>
+                    <a:srcRect t="2021" b="2149"/>
+                    <a:stretch>
+                      <a:fillRect/>
+                    </a:stretch>
+                  </pic:blipFill>
+                  <pic:spPr bwMode="auto">
+                    <a:xfrm>
+                      <a:off x="0" y="0"/>
+                      <a:ext cx="3949065" cy="7886483"/>
+                    </a:xfrm>
+                    <a:prstGeom prst="rect">
+                      <a:avLst/>
+                    </a:prstGeom>
+                    <a:noFill/>
+                    <a:ln>
+                      <a:noFill/>
+                    </a:ln>
+                    <a:extLst>
+                      <a:ext uri="{53640926-AAD7-44D8-BBD7-CCE9431645EC}">
+                        <a14:shadowObscured xmlns:a14="http://schemas.microsoft.com/office/drawing/2010/main"/>
+                      </a:ext>
+                    </a:extLst>
+                  </pic:spPr>
+                </pic:pic>
+              </a:graphicData>
+            </a:graphic>
+          </wp:inline>
+        </w:drawing>
+      </w:r>
+    </w:p>
+    <w:p>
+      <w:pPr>
+        <w:pStyle w:val="Caption"/>
+        <w:jc w:val="center"/>
+        <w:rPr>
+          <w:rFonts w:ascii="Times New Roman" w:hAnsi="Times New Roman" w:cs="Times New Roman"/>
+        </w:rPr>
+      </w:pPr>
+      <w:bookmarkStart w:id="32" w:name="_Toc243929255"/>
+      <w:r>
+        <w:rPr>
+          <w:rFonts w:ascii="Times New Roman" w:hAnsi="Times New Roman" w:cs="Times New Roman"/>
+        </w:rPr>
+        <w:t xml:space="preserve">Slika </w:t>
+      </w:r>
+      <w:r>
+        <w:rPr>
+          <w:rFonts w:ascii="Times New Roman" w:hAnsi="Times New Roman" w:cs="Times New Roman"/>
+        </w:rPr>
+        <w:fldChar w:fldCharType="begin"/>
+      </w:r>
+      <w:r>
+        <w:rPr>
+          <w:rFonts w:ascii="Times New Roman" w:hAnsi="Times New Roman" w:cs="Times New Roman"/>
+        </w:rPr>
+        <w:instrText xml:space="preserve"> SEQ Slika \* ARABIC </w:instrText>
+      </w:r>
+      <w:r>
+        <w:rPr>
+          <w:rFonts w:ascii="Times New Roman" w:hAnsi="Times New Roman" w:cs="Times New Roman"/>
+        </w:rPr>
+        <w:fldChar w:fldCharType="separate"/>
+      </w:r>
+      <w:r>
+        <w:rPr>
+          <w:rFonts w:ascii="Times New Roman" w:hAnsi="Times New Roman" w:cs="Times New Roman"/>
+          <w:noProof/>
+        </w:rPr>
+        <w:t>2</w:t>
+      </w:r>
+      <w:r>
+        <w:rPr>
+          <w:rFonts w:ascii="Times New Roman" w:hAnsi="Times New Roman" w:cs="Times New Roman"/>
+        </w:rPr>
+        <w:fldChar w:fldCharType="end"/>
+      </w:r>
+      <w:r>
+        <w:rPr>
+          <w:rFonts w:ascii="Times New Roman" w:hAnsi="Times New Roman" w:cs="Times New Roman"/>
+        </w:rPr>
+        <w:t>: AS-IS model postojećeg poslovnog procesa tehničkih inspekcija dronovima</w:t>
+      </w:r>
+      <w:bookmarkEnd w:id="32"/>
+    </w:p>
+    <w:p>
+      <w:pPr>
+        <w:spacing w:line="276" w:lineRule="auto"/>
+        <w:jc w:val="both"/>
+        <w:rPr>
+          <w:rFonts w:ascii="Times New Roman" w:hAnsi="Times New Roman" w:cs="Times New Roman"/>
+        </w:rPr>
+      </w:pPr>
+      <w:r>
+        <w:rPr>
+          <w:rFonts w:ascii="Times New Roman" w:hAnsi="Times New Roman" w:cs="Times New Roman"/>
+        </w:rPr>
+        <w:lastRenderedPageBreak/>
+        <w:t>Prikazani dijagram opisuje postojeći način organizacije i realizacije tehničkih inspekcija. Zahtjevi klijenata zaprimaju se telefonom ili e-mailom, dok se evidencija, raspoređivanje operatera i opreme te razmjena informacija obavljaju ručno. Nakon inspekcije, prikupljeni materijal prenosi se putem lokalnih računara i vanjskih medija, a tehnički nalazi i završni izvještaji pripremaju se korištenjem odvojenih dokumenata. Ovakav način rada otežava povezivanje podataka, praćenje realizacije inspekcija i pristup prethodnoj dokumentaciji.</w:t>
+      </w:r>
+    </w:p>
+    <w:p>
+      <w:pPr>
         <w:pStyle w:val="Heading2"/>
         <w:numPr>
           <w:ilvl w:val="1"/>
@@ -20299,7 +20609,7 @@
           <w:szCs w:val="28"/>
         </w:rPr>
       </w:pPr>
-      <w:bookmarkStart w:id="32" w:name="_Toc243883910"/>
+      <w:bookmarkStart w:id="33" w:name="_Toc243883910"/>
       <w:r>
         <w:rPr>
           <w:rFonts w:ascii="Times New Roman" w:hAnsi="Times New Roman" w:cs="Times New Roman"/>
@@ -20308,136 +20618,136 @@
           <w:sz w:val="28"/>
           <w:szCs w:val="28"/>
         </w:rPr>
+        <w:t>Problemi postojećeg načina poslovanja</w:t>
+      </w:r>
+      <w:bookmarkEnd w:id="33"/>
+    </w:p>
+    <w:p>
+      <w:pPr>
+        <w:pStyle w:val="NormalWeb"/>
+        <w:spacing w:line="276" w:lineRule="auto"/>
+        <w:jc w:val="both"/>
+        <w:rPr>
+          <w:lang w:val="bs-Latn-BA"/>
+        </w:rPr>
+      </w:pPr>
+      <w:r>
+        <w:rPr>
+          <w:lang w:val="bs-Latn-BA"/>
+        </w:rPr>
+        <w:t>Korištenje nepovezanih alata stvara poteškoće u organizaciji, praćenju i dokumentovanju tehničkih inspekcija. Podaci o klijentima, zahtjevima, terminima, operaterima, snimcima i izvještajima nalaze se u različitim evidencijama, zbog čega zaposleni nemaju jedinstven pregled informacija koje se odnose na određenu inspekciju.</w:t>
+      </w:r>
+    </w:p>
+    <w:p>
+      <w:pPr>
+        <w:pStyle w:val="NormalWeb"/>
+        <w:spacing w:line="276" w:lineRule="auto"/>
+        <w:jc w:val="both"/>
+        <w:rPr>
+          <w:lang w:val="bs-Latn-BA"/>
+        </w:rPr>
+      </w:pPr>
+      <w:r>
+        <w:rPr>
+          <w:lang w:val="bs-Latn-BA"/>
+        </w:rPr>
+        <w:t>Ručno raspoređivanje operatera i opreme zahtijeva dodatnu komunikaciju i povećava mogućnost grešaka prilikom zakazivanja i izmjene termina. Poseban problem predstavlja mogućnost preklapanja termina i dodjeljivanja istog operatera ili drona na više inspekcija u istom vremenskom periodu.</w:t>
+      </w:r>
+    </w:p>
+    <w:p>
+      <w:pPr>
+        <w:pStyle w:val="NormalWeb"/>
+        <w:spacing w:line="276" w:lineRule="auto"/>
+        <w:jc w:val="both"/>
+        <w:rPr>
+          <w:lang w:val="bs-Latn-BA"/>
+        </w:rPr>
+      </w:pPr>
+      <w:r>
+        <w:rPr>
+          <w:lang w:val="bs-Latn-BA"/>
+        </w:rPr>
+        <w:t>Nepostojanje centralizovane evidencije statusa zahtjeva otežava koordinatoru praćenje napretka pojedinačnih inspekcija. Klijenti nemaju mogućnost samostalnog uvida u status svog zahtjeva, zbog čega se informacije često moraju provjeravati telefonskim pozivima ili elektronskom poštom.</w:t>
+      </w:r>
+    </w:p>
+    <w:p>
+      <w:pPr>
+        <w:pStyle w:val="NormalWeb"/>
+        <w:spacing w:line="276" w:lineRule="auto"/>
+        <w:jc w:val="both"/>
+        <w:rPr>
+          <w:lang w:val="bs-Latn-BA"/>
+        </w:rPr>
+      </w:pPr>
+      <w:r>
+        <w:rPr>
+          <w:lang w:val="bs-Latn-BA"/>
+        </w:rPr>
+        <w:t>Dodatne poteškoće pojavljuju se pri upravljanju fotografijama i videozapisima. Datoteke zauzimaju značajan prostor, prenose se između različitih uređaja, a njihovo imenovanje i arhiviranje nisu standardizovani. Pronalaženje materijala prethodnih inspekcija može zahtijevati pregled više foldera i diskova.</w:t>
+      </w:r>
+    </w:p>
+    <w:p>
+      <w:pPr>
+        <w:pStyle w:val="NormalWeb"/>
+        <w:spacing w:line="276" w:lineRule="auto"/>
+        <w:jc w:val="both"/>
+        <w:rPr>
+          <w:lang w:val="bs-Latn-BA"/>
+        </w:rPr>
+      </w:pPr>
+      <w:r>
+        <w:rPr>
+          <w:lang w:val="bs-Latn-BA"/>
+        </w:rPr>
+        <w:t>Ručno pravljenje sigurnosnih kopija ne osigurava dosljedno obuhvatanje svih važnih podataka. Čuvanje dokumentacije na različitim uređajima dodatno otežava kontrolu pristupa povjerljivim informacijama i povećava rizik od njihovog gubitka.</w:t>
+      </w:r>
+    </w:p>
+    <w:p>
+      <w:pPr>
+        <w:pStyle w:val="NormalWeb"/>
+        <w:spacing w:line="276" w:lineRule="auto"/>
+        <w:jc w:val="both"/>
+        <w:rPr>
+          <w:lang w:val="bs-Latn-BA"/>
+        </w:rPr>
+      </w:pPr>
+      <w:r>
+        <w:rPr>
+          <w:lang w:val="bs-Latn-BA"/>
+        </w:rPr>
+        <w:t>Problemi postoje i pri stručnoj analizi prikupljenog materijala. Tehnički nalazi evidentiraju se u odvojenim dokumentima, a njihovo povezivanje s odgovarajućim fotografijama, objektima i ranijim inspekcijama zahtijeva dodatni ručni rad. Ne postoji jedinstven način praćenja da li je materijal pregledan, jesu li nalazi potvrđeni i da li je završni izvještaj dostavljen klijentu.</w:t>
+      </w:r>
+    </w:p>
+    <w:p>
+      <w:pPr>
+        <w:pStyle w:val="NormalWeb"/>
+        <w:spacing w:line="276" w:lineRule="auto"/>
+        <w:jc w:val="both"/>
+        <w:rPr>
+          <w:lang w:val="bs-Latn-BA"/>
+        </w:rPr>
+      </w:pPr>
+      <w:r>
+        <w:rPr>
+          <w:lang w:val="bs-Latn-BA"/>
+        </w:rPr>
+        <w:t>Navedeni nedostaci mogu dovesti do povećanog administrativnog opterećenja, sporije obrade zahtjeva, otežane koordinacije zaposlenih, dupliranja podataka i smanjene pouzdanosti dokumentacije.</w:t>
+      </w:r>
+    </w:p>
+    <w:p>
+      <w:pPr>
+        <w:pStyle w:val="NormalWeb"/>
+        <w:spacing w:line="276" w:lineRule="auto"/>
+        <w:jc w:val="both"/>
+        <w:rPr>
+          <w:lang w:val="bs-Latn-BA"/>
+        </w:rPr>
+      </w:pPr>
+      <w:r>
+        <w:rPr>
+          <w:lang w:val="bs-Latn-BA"/>
+        </w:rPr>
         <w:lastRenderedPageBreak/>
-        <w:t>Problemi postojećeg načina poslovanja</w:t>
-      </w:r>
-      <w:bookmarkEnd w:id="32"/>
-    </w:p>
-    <w:p>
-      <w:pPr>
-        <w:pStyle w:val="NormalWeb"/>
-        <w:spacing w:line="276" w:lineRule="auto"/>
-        <w:jc w:val="both"/>
-        <w:rPr>
-          <w:lang w:val="bs-Latn-BA"/>
-        </w:rPr>
-      </w:pPr>
-      <w:r>
-        <w:rPr>
-          <w:lang w:val="bs-Latn-BA"/>
-        </w:rPr>
-        <w:t>Korištenje nepovezanih alata stvara poteškoće u organizaciji, praćenju i dokumentovanju tehničkih inspekcija. Podaci o klijentima, zahtjevima, terminima, operaterima, snimcima i izvještajima nalaze se u različitim evidencijama, zbog čega zaposleni nemaju jedinstven pregled informacija koje se odnose na određenu inspekciju.</w:t>
-      </w:r>
-    </w:p>
-    <w:p>
-      <w:pPr>
-        <w:pStyle w:val="NormalWeb"/>
-        <w:spacing w:line="276" w:lineRule="auto"/>
-        <w:jc w:val="both"/>
-        <w:rPr>
-          <w:lang w:val="bs-Latn-BA"/>
-        </w:rPr>
-      </w:pPr>
-      <w:r>
-        <w:rPr>
-          <w:lang w:val="bs-Latn-BA"/>
-        </w:rPr>
-        <w:t>Ručno raspoređivanje operatera i opreme zahtijeva dodatnu komunikaciju i povećava mogućnost grešaka prilikom zakazivanja i izmjene termina. Poseban problem predstavlja mogućnost preklapanja termina i dodjeljivanja istog operatera ili drona na više inspekcija u istom vremenskom periodu.</w:t>
-      </w:r>
-    </w:p>
-    <w:p>
-      <w:pPr>
-        <w:pStyle w:val="NormalWeb"/>
-        <w:spacing w:line="276" w:lineRule="auto"/>
-        <w:jc w:val="both"/>
-        <w:rPr>
-          <w:lang w:val="bs-Latn-BA"/>
-        </w:rPr>
-      </w:pPr>
-      <w:r>
-        <w:rPr>
-          <w:lang w:val="bs-Latn-BA"/>
-        </w:rPr>
-        <w:t>Nepostojanje centralizovane evidencije statusa zahtjeva otežava koordinatoru praćenje napretka pojedinačnih inspekcija. Klijenti nemaju mogućnost samostalnog uvida u status svog zahtjeva, zbog čega se informacije često moraju provjeravati telefonskim pozivima ili elektronskom poštom.</w:t>
-      </w:r>
-    </w:p>
-    <w:p>
-      <w:pPr>
-        <w:pStyle w:val="NormalWeb"/>
-        <w:spacing w:line="276" w:lineRule="auto"/>
-        <w:jc w:val="both"/>
-        <w:rPr>
-          <w:lang w:val="bs-Latn-BA"/>
-        </w:rPr>
-      </w:pPr>
-      <w:r>
-        <w:rPr>
-          <w:lang w:val="bs-Latn-BA"/>
-        </w:rPr>
-        <w:t>Dodatne poteškoće pojavljuju se pri upravljanju fotografijama i videozapisima. Datoteke zauzimaju značajan prostor, prenose se između različitih uređaja, a njihovo imenovanje i arhiviranje nisu standardizovani. Pronalaženje materijala prethodnih inspekcija može zahtijevati pregled više foldera i diskova.</w:t>
-      </w:r>
-    </w:p>
-    <w:p>
-      <w:pPr>
-        <w:pStyle w:val="NormalWeb"/>
-        <w:spacing w:line="276" w:lineRule="auto"/>
-        <w:jc w:val="both"/>
-        <w:rPr>
-          <w:lang w:val="bs-Latn-BA"/>
-        </w:rPr>
-      </w:pPr>
-      <w:r>
-        <w:rPr>
-          <w:lang w:val="bs-Latn-BA"/>
-        </w:rPr>
-        <w:t>Ručno pravljenje sigurnosnih kopija ne osigurava dosljedno obuhvatanje svih važnih podataka. Čuvanje dokumentacije na različitim uređajima dodatno otežava kontrolu pristupa povjerljivim informacijama i povećava rizik od njihovog gubitka.</w:t>
-      </w:r>
-    </w:p>
-    <w:p>
-      <w:pPr>
-        <w:pStyle w:val="NormalWeb"/>
-        <w:spacing w:line="276" w:lineRule="auto"/>
-        <w:jc w:val="both"/>
-        <w:rPr>
-          <w:lang w:val="bs-Latn-BA"/>
-        </w:rPr>
-      </w:pPr>
-      <w:r>
-        <w:rPr>
-          <w:lang w:val="bs-Latn-BA"/>
-        </w:rPr>
-        <w:t>Problemi postoje i pri stručnoj analizi prikupljenog materijala. Tehnički nalazi evidentiraju se u odvojenim dokumentima, a njihovo povezivanje s odgovarajućim fotografijama, objektima i ranijim inspekcijama zahtijeva dodatni ručni rad. Ne postoji jedinstven način praćenja da li je materijal pregledan, jesu li nalazi potvrđeni i da li je završni izvještaj dostavljen klijentu.</w:t>
-      </w:r>
-    </w:p>
-    <w:p>
-      <w:pPr>
-        <w:pStyle w:val="NormalWeb"/>
-        <w:spacing w:line="276" w:lineRule="auto"/>
-        <w:jc w:val="both"/>
-        <w:rPr>
-          <w:lang w:val="bs-Latn-BA"/>
-        </w:rPr>
-      </w:pPr>
-      <w:r>
-        <w:rPr>
-          <w:lang w:val="bs-Latn-BA"/>
-        </w:rPr>
-        <w:t>Navedeni nedostaci mogu dovesti do povećanog administrativnog opterećenja, sporije obrade zahtjeva, otežane koordinacije zaposlenih, dupliranja podataka i smanjene pouzdanosti dokumentacije.</w:t>
-      </w:r>
-    </w:p>
-    <w:p>
-      <w:pPr>
-        <w:pStyle w:val="NormalWeb"/>
-        <w:spacing w:line="276" w:lineRule="auto"/>
-        <w:jc w:val="both"/>
-        <w:rPr>
-          <w:lang w:val="bs-Latn-BA"/>
-        </w:rPr>
-      </w:pPr>
-      <w:r>
-        <w:rPr>
-          <w:lang w:val="bs-Latn-BA"/>
-        </w:rPr>
         <w:t>Zbog toga se javlja potreba za uvođenjem centralizovanog informacionog sistema koji će objediniti ključne poslovne aktivnosti, unaprijediti organizaciju inspekcija i omogućiti sigurnije i preglednije upravljanje podacima.</w:t>
       </w:r>
     </w:p>
@@ -20458,7 +20768,7 @@
           <w:szCs w:val="28"/>
         </w:rPr>
       </w:pPr>
-      <w:bookmarkStart w:id="33" w:name="_Toc243883911"/>
+      <w:bookmarkStart w:id="34" w:name="_Toc243883911"/>
       <w:r>
         <w:rPr>
           <w:rFonts w:ascii="Times New Roman" w:hAnsi="Times New Roman" w:cs="Times New Roman"/>
@@ -20467,10 +20777,9 @@
           <w:sz w:val="28"/>
           <w:szCs w:val="28"/>
         </w:rPr>
-        <w:lastRenderedPageBreak/>
         <w:t>Zahtjev za sistemom (System Request)</w:t>
       </w:r>
-      <w:bookmarkEnd w:id="33"/>
+      <w:bookmarkEnd w:id="34"/>
     </w:p>
     <w:p>
       <w:pPr>
@@ -20502,7 +20811,7 @@
           <w:bCs/>
         </w:rPr>
       </w:pPr>
-      <w:bookmarkStart w:id="34" w:name="_Toc243883912"/>
+      <w:bookmarkStart w:id="35" w:name="_Toc243883912"/>
       <w:r>
         <w:rPr>
           <w:rFonts w:ascii="Times New Roman" w:hAnsi="Times New Roman" w:cs="Times New Roman"/>
@@ -20511,7 +20820,7 @@
         </w:rPr>
         <w:t>Poslovna potreba</w:t>
       </w:r>
-      <w:bookmarkEnd w:id="34"/>
+      <w:bookmarkEnd w:id="35"/>
     </w:p>
     <w:p>
       <w:pPr>
@@ -20696,7 +21005,7 @@
           <w:bCs/>
         </w:rPr>
       </w:pPr>
-      <w:bookmarkStart w:id="35" w:name="_Toc243883913"/>
+      <w:bookmarkStart w:id="36" w:name="_Toc243883913"/>
       <w:r>
         <w:rPr>
           <w:rFonts w:ascii="Times New Roman" w:hAnsi="Times New Roman" w:cs="Times New Roman"/>
@@ -20705,7 +21014,7 @@
         </w:rPr>
         <w:t>Poslovni zahtjevi</w:t>
       </w:r>
-      <w:bookmarkEnd w:id="35"/>
+      <w:bookmarkEnd w:id="36"/>
     </w:p>
     <w:p>
       <w:pPr>
@@ -20753,6 +21062,7 @@
         <w:rPr>
           <w:lang w:val="bs-Latn-BA"/>
         </w:rPr>
+        <w:lastRenderedPageBreak/>
         <w:t>Sistem treba omogućiti jedinstvenu evidenciju u kojoj će svaka inspekcija biti povezana s odgovarajućim klijentom, objektom, zahtjevom, terminom, operaterom, opremom, snimcima, tehničkim nalazima i završnim izvještajem.</w:t>
       </w:r>
     </w:p>
@@ -20786,8 +21096,223 @@
         <w:rPr>
           <w:lang w:val="bs-Latn-BA"/>
         </w:rPr>
+        <w:t>Ovlaštenim korisnicima potrebno je omogućiti pristup svim povezanim podacima i dokumentima određene inspekcije, bez pretraživanja različitih računara, eksternih diskova ili komunikacijskih kanala.</w:t>
+      </w:r>
+    </w:p>
+    <w:p>
+      <w:pPr>
+        <w:pStyle w:val="NormalWeb"/>
+        <w:spacing w:line="276" w:lineRule="auto"/>
+        <w:jc w:val="both"/>
+        <w:rPr>
+          <w:lang w:val="bs-Latn-BA"/>
+        </w:rPr>
+      </w:pPr>
+      <w:r>
+        <w:rPr>
+          <w:rStyle w:val="Strong"/>
+          <w:lang w:val="bs-Latn-BA"/>
+        </w:rPr>
+        <w:t>3. Upravljanje fotografijama i videozapisima</w:t>
+      </w:r>
+    </w:p>
+    <w:p>
+      <w:pPr>
+        <w:pStyle w:val="NormalWeb"/>
+        <w:spacing w:line="276" w:lineRule="auto"/>
+        <w:jc w:val="both"/>
+        <w:rPr>
+          <w:lang w:val="bs-Latn-BA"/>
+        </w:rPr>
+      </w:pPr>
+      <w:r>
+        <w:rPr>
+          <w:lang w:val="bs-Latn-BA"/>
+        </w:rPr>
+        <w:t>Sistem treba omogućiti učitavanje, organizaciju, pohranu, pregled i preuzimanje fotografija i videozapisa te njihovo povezivanje s odgovarajućim inspekcijama.</w:t>
+      </w:r>
+    </w:p>
+    <w:p>
+      <w:pPr>
+        <w:pStyle w:val="NormalWeb"/>
+        <w:spacing w:line="276" w:lineRule="auto"/>
+        <w:jc w:val="both"/>
+        <w:rPr>
+          <w:lang w:val="bs-Latn-BA"/>
+        </w:rPr>
+      </w:pPr>
+      <w:r>
+        <w:rPr>
+          <w:rStyle w:val="Strong"/>
+          <w:lang w:val="bs-Latn-BA"/>
+        </w:rPr>
+        <w:t>4. Planiranje i raspoređivanje resursa</w:t>
+      </w:r>
+    </w:p>
+    <w:p>
+      <w:pPr>
+        <w:pStyle w:val="NormalWeb"/>
+        <w:spacing w:line="276" w:lineRule="auto"/>
+        <w:jc w:val="both"/>
+        <w:rPr>
+          <w:lang w:val="bs-Latn-BA"/>
+        </w:rPr>
+      </w:pPr>
+      <w:r>
+        <w:rPr>
+          <w:lang w:val="bs-Latn-BA"/>
+        </w:rPr>
+        <w:t>Koordinatoru je potrebno omogućiti pregled zakazanih inspekcija, dostupnosti operatera i opreme te upozorenja na moguće preklapanje termina.</w:t>
+      </w:r>
+    </w:p>
+    <w:p>
+      <w:pPr>
+        <w:pStyle w:val="NormalWeb"/>
+        <w:spacing w:line="276" w:lineRule="auto"/>
+        <w:jc w:val="both"/>
+        <w:rPr>
+          <w:lang w:val="bs-Latn-BA"/>
+        </w:rPr>
+      </w:pPr>
+      <w:r>
+        <w:rPr>
+          <w:rStyle w:val="Strong"/>
+          <w:lang w:val="bs-Latn-BA"/>
+        </w:rPr>
+        <w:t>5. Praćenje statusa zahtjeva i inspekcija</w:t>
+      </w:r>
+    </w:p>
+    <w:p>
+      <w:pPr>
+        <w:pStyle w:val="NormalWeb"/>
+        <w:spacing w:line="276" w:lineRule="auto"/>
+        <w:jc w:val="both"/>
+        <w:rPr>
+          <w:lang w:val="bs-Latn-BA"/>
+        </w:rPr>
+      </w:pPr>
+      <w:r>
+        <w:rPr>
+          <w:lang w:val="bs-Latn-BA"/>
+        </w:rPr>
+        <w:t>Sistem treba omogućiti praćenje postupka od zaprimanja zahtjeva i zakazivanja termina do završetka inspekcije, izrade i dostavljanja izvještaja.</w:t>
+      </w:r>
+    </w:p>
+    <w:p>
+      <w:pPr>
+        <w:pStyle w:val="NormalWeb"/>
+        <w:spacing w:line="276" w:lineRule="auto"/>
+        <w:jc w:val="both"/>
+        <w:rPr>
+          <w:lang w:val="bs-Latn-BA"/>
+        </w:rPr>
+      </w:pPr>
+      <w:r>
+        <w:rPr>
+          <w:rStyle w:val="Strong"/>
+          <w:lang w:val="bs-Latn-BA"/>
+        </w:rPr>
+        <w:t>6. Informisanje klijenata</w:t>
+      </w:r>
+    </w:p>
+    <w:p>
+      <w:pPr>
+        <w:pStyle w:val="NormalWeb"/>
+        <w:spacing w:line="276" w:lineRule="auto"/>
+        <w:jc w:val="both"/>
+        <w:rPr>
+          <w:lang w:val="bs-Latn-BA"/>
+        </w:rPr>
+      </w:pPr>
+      <w:r>
+        <w:rPr>
+          <w:lang w:val="bs-Latn-BA"/>
+        </w:rPr>
+        <w:t>Klijentima je potrebno omogućiti pregled statusa vlastitih zahtjeva i obavještavanje o važnim promjenama, uključujući potvrdu termina, promjenu termina i dostupnost završnog izvještaja.</w:t>
+      </w:r>
+    </w:p>
+    <w:p>
+      <w:pPr>
+        <w:pStyle w:val="NormalWeb"/>
+        <w:spacing w:line="276" w:lineRule="auto"/>
+        <w:jc w:val="both"/>
+        <w:rPr>
+          <w:lang w:val="bs-Latn-BA"/>
+        </w:rPr>
+      </w:pPr>
+      <w:r>
+        <w:rPr>
+          <w:rStyle w:val="Strong"/>
+          <w:lang w:val="bs-Latn-BA"/>
+        </w:rPr>
+        <w:t>7. Podrška stručnoj analizi i AI kategorizaciji</w:t>
+      </w:r>
+    </w:p>
+    <w:p>
+      <w:pPr>
+        <w:pStyle w:val="NormalWeb"/>
+        <w:spacing w:line="276" w:lineRule="auto"/>
+        <w:jc w:val="both"/>
+        <w:rPr>
+          <w:lang w:val="bs-Latn-BA"/>
+        </w:rPr>
+      </w:pPr>
+      <w:r>
+        <w:rPr>
+          <w:lang w:val="bs-Latn-BA"/>
+        </w:rPr>
+        <w:t>Sistem treba omogućiti evidentiranje tehničkih nalaza i njihovo povezivanje s prikupljenim materijalom. Obavezna AI komponenta treba predlagati preliminarne kategorije mogućih oštećenja na fotografijama, pri čemu tehnički inspektor mora imati mogućnost pregleda, potvrđivanja, izmjene ili odbacivanja predloženih rezultata.</w:t>
+      </w:r>
+    </w:p>
+    <w:p>
+      <w:pPr>
+        <w:pStyle w:val="NormalWeb"/>
+        <w:spacing w:line="276" w:lineRule="auto"/>
+        <w:jc w:val="both"/>
+        <w:rPr>
+          <w:lang w:val="bs-Latn-BA"/>
+        </w:rPr>
+      </w:pPr>
+      <w:r>
+        <w:rPr>
+          <w:rStyle w:val="Strong"/>
+          <w:lang w:val="bs-Latn-BA"/>
+        </w:rPr>
+        <w:t>8. Generisanje završnih izvještaja</w:t>
+      </w:r>
+    </w:p>
+    <w:p>
+      <w:pPr>
+        <w:pStyle w:val="NormalWeb"/>
+        <w:spacing w:line="276" w:lineRule="auto"/>
+        <w:jc w:val="both"/>
+        <w:rPr>
+          <w:lang w:val="bs-Latn-BA"/>
+        </w:rPr>
+      </w:pPr>
+      <w:r>
+        <w:rPr>
+          <w:lang w:val="bs-Latn-BA"/>
+        </w:rPr>
+        <w:t>Sistem treba omogućiti izradu završnog izvještaja na osnovu evidentiranih podataka i potvrđenih tehničkih nalaza, uz njegov pregled i odobravanje od strane tehničkog inspektora.</w:t>
+      </w:r>
+    </w:p>
+    <w:p>
+      <w:pPr>
+        <w:pStyle w:val="NormalWeb"/>
+        <w:spacing w:line="276" w:lineRule="auto"/>
+        <w:jc w:val="both"/>
+        <w:rPr>
+          <w:lang w:val="bs-Latn-BA"/>
+        </w:rPr>
+      </w:pPr>
+      <w:r>
+        <w:rPr>
+          <w:rStyle w:val="Strong"/>
+          <w:lang w:val="bs-Latn-BA"/>
+        </w:rPr>
         <w:lastRenderedPageBreak/>
-        <w:t>Ovlaštenim korisnicima potrebno je omogućiti pristup svim povezanim podacima i dokumentima određene inspekcije, bez pretraživanja različitih računara, eksternih diskova ili komunikacijskih kanala.</w:t>
+        <w:t>9. Sigurnost i kontrola pristupa</w:t>
       </w:r>
     </w:p>
     <w:p>
@@ -20801,10 +21326,26 @@
       </w:pPr>
       <w:r>
         <w:rPr>
+          <w:lang w:val="bs-Latn-BA"/>
+        </w:rPr>
+        <w:t>Pristup podacima i funkcionalnostima potrebno je ograničiti prema korisničkim ulogama i ovlaštenjima. Sistem treba podržavati definisan postupak sigurnosnog kopiranja podataka.</w:t>
+      </w:r>
+    </w:p>
+    <w:p>
+      <w:pPr>
+        <w:pStyle w:val="NormalWeb"/>
+        <w:spacing w:line="276" w:lineRule="auto"/>
+        <w:jc w:val="both"/>
+        <w:rPr>
+          <w:lang w:val="bs-Latn-BA"/>
+        </w:rPr>
+      </w:pPr>
+      <w:r>
+        <w:rPr>
           <w:rStyle w:val="Strong"/>
           <w:lang w:val="bs-Latn-BA"/>
         </w:rPr>
-        <w:t>3. Upravljanje fotografijama i videozapisima</w:t>
+        <w:t>10. Evidencija važnih aktivnosti</w:t>
       </w:r>
     </w:p>
     <w:p>
@@ -20820,238 +21361,6 @@
         <w:rPr>
           <w:lang w:val="bs-Latn-BA"/>
         </w:rPr>
-        <w:t>Sistem treba omogućiti učitavanje, organizaciju, pohranu, pregled i preuzimanje fotografija i videozapisa te njihovo povezivanje s odgovarajućim inspekcijama.</w:t>
-      </w:r>
-    </w:p>
-    <w:p>
-      <w:pPr>
-        <w:pStyle w:val="NormalWeb"/>
-        <w:spacing w:line="276" w:lineRule="auto"/>
-        <w:jc w:val="both"/>
-        <w:rPr>
-          <w:lang w:val="bs-Latn-BA"/>
-        </w:rPr>
-      </w:pPr>
-      <w:r>
-        <w:rPr>
-          <w:rStyle w:val="Strong"/>
-          <w:lang w:val="bs-Latn-BA"/>
-        </w:rPr>
-        <w:t>4. Planiranje i raspoređivanje resursa</w:t>
-      </w:r>
-    </w:p>
-    <w:p>
-      <w:pPr>
-        <w:pStyle w:val="NormalWeb"/>
-        <w:spacing w:line="276" w:lineRule="auto"/>
-        <w:jc w:val="both"/>
-        <w:rPr>
-          <w:lang w:val="bs-Latn-BA"/>
-        </w:rPr>
-      </w:pPr>
-      <w:r>
-        <w:rPr>
-          <w:lang w:val="bs-Latn-BA"/>
-        </w:rPr>
-        <w:t>Koordinatoru je potrebno omogućiti pregled zakazanih inspekcija, dostupnosti operatera i opreme te upozorenja na moguće preklapanje termina.</w:t>
-      </w:r>
-    </w:p>
-    <w:p>
-      <w:pPr>
-        <w:pStyle w:val="NormalWeb"/>
-        <w:spacing w:line="276" w:lineRule="auto"/>
-        <w:jc w:val="both"/>
-        <w:rPr>
-          <w:lang w:val="bs-Latn-BA"/>
-        </w:rPr>
-      </w:pPr>
-      <w:r>
-        <w:rPr>
-          <w:rStyle w:val="Strong"/>
-          <w:lang w:val="bs-Latn-BA"/>
-        </w:rPr>
-        <w:t>5. Praćenje statusa zahtjeva i inspekcija</w:t>
-      </w:r>
-    </w:p>
-    <w:p>
-      <w:pPr>
-        <w:pStyle w:val="NormalWeb"/>
-        <w:spacing w:line="276" w:lineRule="auto"/>
-        <w:jc w:val="both"/>
-        <w:rPr>
-          <w:lang w:val="bs-Latn-BA"/>
-        </w:rPr>
-      </w:pPr>
-      <w:r>
-        <w:rPr>
-          <w:lang w:val="bs-Latn-BA"/>
-        </w:rPr>
-        <w:t>Sistem treba omogućiti praćenje postupka od zaprimanja zahtjeva i zakazivanja termina do završetka inspekcije, izrade i dostavljanja izvještaja.</w:t>
-      </w:r>
-    </w:p>
-    <w:p>
-      <w:pPr>
-        <w:pStyle w:val="NormalWeb"/>
-        <w:spacing w:line="276" w:lineRule="auto"/>
-        <w:jc w:val="both"/>
-        <w:rPr>
-          <w:lang w:val="bs-Latn-BA"/>
-        </w:rPr>
-      </w:pPr>
-      <w:r>
-        <w:rPr>
-          <w:rStyle w:val="Strong"/>
-          <w:lang w:val="bs-Latn-BA"/>
-        </w:rPr>
-        <w:t>6. Informisanje klijenata</w:t>
-      </w:r>
-    </w:p>
-    <w:p>
-      <w:pPr>
-        <w:pStyle w:val="NormalWeb"/>
-        <w:spacing w:line="276" w:lineRule="auto"/>
-        <w:jc w:val="both"/>
-        <w:rPr>
-          <w:lang w:val="bs-Latn-BA"/>
-        </w:rPr>
-      </w:pPr>
-      <w:r>
-        <w:rPr>
-          <w:lang w:val="bs-Latn-BA"/>
-        </w:rPr>
-        <w:t>Klijentima je potrebno omogućiti pregled statusa vlastitih zahtjeva i obavještavanje o važnim promjenama, uključujući potvrdu termina, promjenu termina i dostupnost završnog izvještaja.</w:t>
-      </w:r>
-    </w:p>
-    <w:p>
-      <w:pPr>
-        <w:pStyle w:val="NormalWeb"/>
-        <w:spacing w:line="276" w:lineRule="auto"/>
-        <w:jc w:val="both"/>
-        <w:rPr>
-          <w:lang w:val="bs-Latn-BA"/>
-        </w:rPr>
-      </w:pPr>
-      <w:r>
-        <w:rPr>
-          <w:rStyle w:val="Strong"/>
-          <w:lang w:val="bs-Latn-BA"/>
-        </w:rPr>
-        <w:t>7. Podrška stručnoj analizi i AI kategorizaciji</w:t>
-      </w:r>
-    </w:p>
-    <w:p>
-      <w:pPr>
-        <w:pStyle w:val="NormalWeb"/>
-        <w:spacing w:line="276" w:lineRule="auto"/>
-        <w:jc w:val="both"/>
-        <w:rPr>
-          <w:lang w:val="bs-Latn-BA"/>
-        </w:rPr>
-      </w:pPr>
-      <w:r>
-        <w:rPr>
-          <w:lang w:val="bs-Latn-BA"/>
-        </w:rPr>
-        <w:t>Sistem treba omogućiti evidentiranje tehničkih nalaza i njihovo povezivanje s prikupljenim materijalom. Obavezna AI komponenta treba predlagati preliminarne kategorije mogućih oštećenja na fotografijama, pri čemu tehnički inspektor mora imati mogućnost pregleda, potvrđivanja, izmjene ili odbacivanja predloženih rezultata.</w:t>
-      </w:r>
-    </w:p>
-    <w:p>
-      <w:pPr>
-        <w:pStyle w:val="NormalWeb"/>
-        <w:spacing w:line="276" w:lineRule="auto"/>
-        <w:jc w:val="both"/>
-        <w:rPr>
-          <w:lang w:val="bs-Latn-BA"/>
-        </w:rPr>
-      </w:pPr>
-      <w:r>
-        <w:rPr>
-          <w:rStyle w:val="Strong"/>
-          <w:lang w:val="bs-Latn-BA"/>
-        </w:rPr>
-        <w:t>8. Generisanje završnih izvještaja</w:t>
-      </w:r>
-    </w:p>
-    <w:p>
-      <w:pPr>
-        <w:pStyle w:val="NormalWeb"/>
-        <w:spacing w:line="276" w:lineRule="auto"/>
-        <w:jc w:val="both"/>
-        <w:rPr>
-          <w:lang w:val="bs-Latn-BA"/>
-        </w:rPr>
-      </w:pPr>
-      <w:r>
-        <w:rPr>
-          <w:lang w:val="bs-Latn-BA"/>
-        </w:rPr>
-        <w:t>Sistem treba omogućiti izradu završnog izvještaja na osnovu evidentiranih podataka i potvrđenih tehničkih nalaza, uz njegov pregled i odobravanje od strane tehničkog inspektora.</w:t>
-      </w:r>
-    </w:p>
-    <w:p>
-      <w:pPr>
-        <w:pStyle w:val="NormalWeb"/>
-        <w:spacing w:line="276" w:lineRule="auto"/>
-        <w:jc w:val="both"/>
-        <w:rPr>
-          <w:lang w:val="bs-Latn-BA"/>
-        </w:rPr>
-      </w:pPr>
-      <w:r>
-        <w:rPr>
-          <w:rStyle w:val="Strong"/>
-          <w:lang w:val="bs-Latn-BA"/>
-        </w:rPr>
-        <w:t>9. Sigurnost i kontrola pristupa</w:t>
-      </w:r>
-    </w:p>
-    <w:p>
-      <w:pPr>
-        <w:pStyle w:val="NormalWeb"/>
-        <w:spacing w:line="276" w:lineRule="auto"/>
-        <w:jc w:val="both"/>
-        <w:rPr>
-          <w:lang w:val="bs-Latn-BA"/>
-        </w:rPr>
-      </w:pPr>
-      <w:r>
-        <w:rPr>
-          <w:lang w:val="bs-Latn-BA"/>
-        </w:rPr>
-        <w:t>Pristup podacima i funkcionalnostima potrebno je ograničiti prema korisničkim ulogama i ovlaštenjima. Sistem treba podržavati definisan postupak sigurnosnog kopiranja podataka.</w:t>
-      </w:r>
-    </w:p>
-    <w:p>
-      <w:pPr>
-        <w:pStyle w:val="NormalWeb"/>
-        <w:spacing w:line="276" w:lineRule="auto"/>
-        <w:jc w:val="both"/>
-        <w:rPr>
-          <w:lang w:val="bs-Latn-BA"/>
-        </w:rPr>
-      </w:pPr>
-      <w:r>
-        <w:rPr>
-          <w:rStyle w:val="Strong"/>
-          <w:lang w:val="bs-Latn-BA"/>
-        </w:rPr>
-        <w:t>10. Evidencija važnih aktivnosti</w:t>
-      </w:r>
-    </w:p>
-    <w:p>
-      <w:pPr>
-        <w:pStyle w:val="NormalWeb"/>
-        <w:spacing w:line="276" w:lineRule="auto"/>
-        <w:jc w:val="both"/>
-        <w:rPr>
-          <w:lang w:val="bs-Latn-BA"/>
-        </w:rPr>
-      </w:pPr>
-      <w:r>
-        <w:rPr>
-          <w:lang w:val="bs-Latn-BA"/>
-        </w:rPr>
-        <w:lastRenderedPageBreak/>
         <w:t>Potrebno je omogućiti praćenje važnih promjena, uključujući izmjene termina, promjene statusa, učitavanje datoteka, potvrđivanje AI prijedloga i objavljivanje izvještaja, kako bi se moglo utvrditi ko je izvršio određenu aktivnost i kada.</w:t>
       </w:r>
     </w:p>
@@ -21070,7 +21379,7 @@
           <w:bCs/>
         </w:rPr>
       </w:pPr>
-      <w:bookmarkStart w:id="36" w:name="_Toc243883914"/>
+      <w:bookmarkStart w:id="37" w:name="_Toc243883914"/>
       <w:r>
         <w:rPr>
           <w:rFonts w:ascii="Times New Roman" w:hAnsi="Times New Roman" w:cs="Times New Roman"/>
@@ -21079,7 +21388,7 @@
         </w:rPr>
         <w:t>Očekivana poslovna vrijednost</w:t>
       </w:r>
-      <w:bookmarkEnd w:id="36"/>
+      <w:bookmarkEnd w:id="37"/>
     </w:p>
     <w:p>
       <w:pPr>
@@ -21259,7 +21568,7 @@
           <w:bCs/>
         </w:rPr>
       </w:pPr>
-      <w:bookmarkStart w:id="37" w:name="_Toc243883915"/>
+      <w:bookmarkStart w:id="38" w:name="_Toc243883915"/>
       <w:r>
         <w:rPr>
           <w:rFonts w:ascii="Times New Roman" w:hAnsi="Times New Roman" w:cs="Times New Roman"/>
@@ -21268,7 +21577,7 @@
         </w:rPr>
         <w:t>Dodatni zahtjevi i ograničenja</w:t>
       </w:r>
-      <w:bookmarkEnd w:id="37"/>
+      <w:bookmarkEnd w:id="38"/>
     </w:p>
     <w:p>
       <w:pPr>
@@ -21299,6 +21608,7 @@
         <w:rPr>
           <w:lang w:val="bs-Latn-BA"/>
         </w:rPr>
+        <w:lastRenderedPageBreak/>
         <w:t>Posebnu pažnju zahtijeva implementacija AI komponente, koja mora omogućiti stručnu provjeru rezultata i ne smije samostalno donositi konačne tehničke zaključke o stanju ili sigurnosti objekta.</w:t>
       </w:r>
     </w:p>
@@ -21331,7 +21641,6 @@
         <w:rPr>
           <w:lang w:val="bs-Latn-BA"/>
         </w:rPr>
-        <w:lastRenderedPageBreak/>
         <w:t>Tehnološko rješenje, infrastruktura i način integracije AI komponente bit će razmotreni u okviru analiza izvedivosti.</w:t>
       </w:r>
     </w:p>
@@ -21352,7 +21661,7 @@
           <w:szCs w:val="28"/>
         </w:rPr>
       </w:pPr>
-      <w:bookmarkStart w:id="38" w:name="_Toc243883916"/>
+      <w:bookmarkStart w:id="39" w:name="_Toc243883916"/>
       <w:r>
         <w:rPr>
           <w:rFonts w:ascii="Times New Roman" w:hAnsi="Times New Roman" w:cs="Times New Roman"/>
@@ -21363,7 +21672,7 @@
         </w:rPr>
         <w:t>Predloženo rješenje</w:t>
       </w:r>
-      <w:bookmarkEnd w:id="38"/>
+      <w:bookmarkEnd w:id="39"/>
     </w:p>
     <w:p>
       <w:pPr>
@@ -21459,6 +21768,251 @@
           <w:lang w:val="bs-Latn-BA"/>
         </w:rPr>
         <w:t>DroneInspect će na taj način povezati administrativni i stručni dio poslovanja, unaprijediti razmjenu informacija i omogućiti pregledan tok inspekcija, bez preuzimanja aktivnosti koje zahtijevaju neposredan rad operatera drona ili stručnu procjenu tehničkog inspektora.</w:t>
+      </w:r>
+    </w:p>
+    <w:p>
+      <w:pPr>
+        <w:pStyle w:val="NormalWeb"/>
+        <w:spacing w:line="276" w:lineRule="auto"/>
+        <w:jc w:val="both"/>
+        <w:rPr>
+          <w:lang w:val="bs-Latn-BA"/>
+        </w:rPr>
+      </w:pPr>
+    </w:p>
+    <w:p>
+      <w:pPr>
+        <w:pStyle w:val="NormalWeb"/>
+        <w:spacing w:line="276" w:lineRule="auto"/>
+        <w:jc w:val="both"/>
+        <w:rPr>
+          <w:lang w:val="bs-Latn-BA"/>
+        </w:rPr>
+      </w:pPr>
+    </w:p>
+    <w:p>
+      <w:pPr>
+        <w:pStyle w:val="NormalWeb"/>
+        <w:spacing w:line="276" w:lineRule="auto"/>
+        <w:ind w:left="720" w:firstLine="720"/>
+        <w:jc w:val="both"/>
+        <w:rPr>
+          <w:lang w:val="bs-Latn-BA"/>
+        </w:rPr>
+      </w:pPr>
+      <w:r>
+        <w:rPr>
+          <w:noProof/>
+          <w:lang w:val="bs-Latn-BA"/>
+        </w:rPr>
+        <w:lastRenderedPageBreak/>
+        <w:drawing>
+          <wp:inline distT="0" distB="0" distL="0" distR="0" wp14:anchorId="3A22025F" wp14:editId="17976C8E">
+            <wp:extent cx="4248150" cy="8138795"/>
+            <wp:effectExtent l="0" t="0" r="0" b="0"/>
+            <wp:docPr id="1503549754" name="Picture 4"/>
+            <wp:cNvGraphicFramePr>
+              <a:graphicFrameLocks xmlns:a="http://schemas.openxmlformats.org/drawingml/2006/main" noChangeAspect="1"/>
+            </wp:cNvGraphicFramePr>
+            <a:graphic xmlns:a="http://schemas.openxmlformats.org/drawingml/2006/main">
+              <a:graphicData uri="http://schemas.openxmlformats.org/drawingml/2006/picture">
+                <pic:pic xmlns:pic="http://schemas.openxmlformats.org/drawingml/2006/picture">
+                  <pic:nvPicPr>
+                    <pic:cNvPr id="0" name="Picture 2"/>
+                    <pic:cNvPicPr>
+                      <a:picLocks noChangeAspect="1" noChangeArrowheads="1"/>
+                    </pic:cNvPicPr>
+                  </pic:nvPicPr>
+                  <pic:blipFill rotWithShape="1">
+                    <a:blip r:embed="rId11">
+                      <a:extLst>
+                        <a:ext uri="{28A0092B-C50C-407E-A947-70E740481C1C}">
+                          <a14:useLocalDpi xmlns:a14="http://schemas.microsoft.com/office/drawing/2010/main" val="0"/>
+                        </a:ext>
+                      </a:extLst>
+                    </a:blip>
+                    <a:srcRect r="2519" b="45374"/>
+                    <a:stretch>
+                      <a:fillRect/>
+                    </a:stretch>
+                  </pic:blipFill>
+                  <pic:spPr bwMode="auto">
+                    <a:xfrm>
+                      <a:off x="0" y="0"/>
+                      <a:ext cx="4333410" cy="8302139"/>
+                    </a:xfrm>
+                    <a:prstGeom prst="rect">
+                      <a:avLst/>
+                    </a:prstGeom>
+                    <a:noFill/>
+                    <a:ln>
+                      <a:noFill/>
+                    </a:ln>
+                    <a:extLst>
+                      <a:ext uri="{53640926-AAD7-44D8-BBD7-CCE9431645EC}">
+                        <a14:shadowObscured xmlns:a14="http://schemas.microsoft.com/office/drawing/2010/main"/>
+                      </a:ext>
+                    </a:extLst>
+                  </pic:spPr>
+                </pic:pic>
+              </a:graphicData>
+            </a:graphic>
+          </wp:inline>
+        </w:drawing>
+      </w:r>
+      <w:r>
+        <w:rPr>
+          <w:lang w:val="bs-Latn-BA"/>
+        </w:rPr>
+        <w:t xml:space="preserve"> </w:t>
+      </w:r>
+    </w:p>
+    <w:p>
+      <w:pPr>
+        <w:pStyle w:val="NormalWeb"/>
+        <w:keepNext/>
+        <w:spacing w:line="276" w:lineRule="auto"/>
+        <w:ind w:left="720" w:firstLine="720"/>
+        <w:jc w:val="both"/>
+      </w:pPr>
+      <w:r>
+        <w:lastRenderedPageBreak/>
+        <w:t xml:space="preserve">  </w:t>
+      </w:r>
+      <w:r>
+        <w:rPr>
+          <w:noProof/>
+          <w:lang w:val="bs-Latn-BA"/>
+        </w:rPr>
+        <w:drawing>
+          <wp:inline distT="0" distB="0" distL="0" distR="0" wp14:anchorId="2DB4FC5D" wp14:editId="09E50BF0">
+            <wp:extent cx="4304665" cy="7578993"/>
+            <wp:effectExtent l="0" t="0" r="635" b="3175"/>
+            <wp:docPr id="1069271555" name="Picture 4"/>
+            <wp:cNvGraphicFramePr>
+              <a:graphicFrameLocks xmlns:a="http://schemas.openxmlformats.org/drawingml/2006/main" noChangeAspect="1"/>
+            </wp:cNvGraphicFramePr>
+            <a:graphic xmlns:a="http://schemas.openxmlformats.org/drawingml/2006/main">
+              <a:graphicData uri="http://schemas.openxmlformats.org/drawingml/2006/picture">
+                <pic:pic xmlns:pic="http://schemas.openxmlformats.org/drawingml/2006/picture">
+                  <pic:nvPicPr>
+                    <pic:cNvPr id="0" name="Picture 2"/>
+                    <pic:cNvPicPr>
+                      <a:picLocks noChangeAspect="1" noChangeArrowheads="1"/>
+                    </pic:cNvPicPr>
+                  </pic:nvPicPr>
+                  <pic:blipFill rotWithShape="1">
+                    <a:blip r:embed="rId11">
+                      <a:extLst>
+                        <a:ext uri="{28A0092B-C50C-407E-A947-70E740481C1C}">
+                          <a14:useLocalDpi xmlns:a14="http://schemas.microsoft.com/office/drawing/2010/main" val="0"/>
+                        </a:ext>
+                      </a:extLst>
+                    </a:blip>
+                    <a:srcRect l="9323" t="54789" r="2888"/>
+                    <a:stretch>
+                      <a:fillRect/>
+                    </a:stretch>
+                  </pic:blipFill>
+                  <pic:spPr bwMode="auto">
+                    <a:xfrm>
+                      <a:off x="0" y="0"/>
+                      <a:ext cx="4385444" cy="7721216"/>
+                    </a:xfrm>
+                    <a:prstGeom prst="rect">
+                      <a:avLst/>
+                    </a:prstGeom>
+                    <a:noFill/>
+                    <a:ln>
+                      <a:noFill/>
+                    </a:ln>
+                    <a:extLst>
+                      <a:ext uri="{53640926-AAD7-44D8-BBD7-CCE9431645EC}">
+                        <a14:shadowObscured xmlns:a14="http://schemas.microsoft.com/office/drawing/2010/main"/>
+                      </a:ext>
+                    </a:extLst>
+                  </pic:spPr>
+                </pic:pic>
+              </a:graphicData>
+            </a:graphic>
+          </wp:inline>
+        </w:drawing>
+      </w:r>
+    </w:p>
+    <w:p>
+      <w:pPr>
+        <w:pStyle w:val="Caption"/>
+        <w:jc w:val="center"/>
+        <w:rPr>
+          <w:rFonts w:ascii="Times New Roman" w:hAnsi="Times New Roman" w:cs="Times New Roman"/>
+        </w:rPr>
+      </w:pPr>
+      <w:bookmarkStart w:id="40" w:name="_Toc243929256"/>
+      <w:r>
+        <w:rPr>
+          <w:rFonts w:ascii="Times New Roman" w:hAnsi="Times New Roman" w:cs="Times New Roman"/>
+        </w:rPr>
+        <w:t xml:space="preserve">Slika </w:t>
+      </w:r>
+      <w:r>
+        <w:rPr>
+          <w:rFonts w:ascii="Times New Roman" w:hAnsi="Times New Roman" w:cs="Times New Roman"/>
+        </w:rPr>
+        <w:fldChar w:fldCharType="begin"/>
+      </w:r>
+      <w:r>
+        <w:rPr>
+          <w:rFonts w:ascii="Times New Roman" w:hAnsi="Times New Roman" w:cs="Times New Roman"/>
+        </w:rPr>
+        <w:instrText xml:space="preserve"> SEQ Slika \* ARABIC </w:instrText>
+      </w:r>
+      <w:r>
+        <w:rPr>
+          <w:rFonts w:ascii="Times New Roman" w:hAnsi="Times New Roman" w:cs="Times New Roman"/>
+        </w:rPr>
+        <w:fldChar w:fldCharType="separate"/>
+      </w:r>
+      <w:r>
+        <w:rPr>
+          <w:rFonts w:ascii="Times New Roman" w:hAnsi="Times New Roman" w:cs="Times New Roman"/>
+          <w:noProof/>
+        </w:rPr>
+        <w:t>3</w:t>
+      </w:r>
+      <w:r>
+        <w:rPr>
+          <w:rFonts w:ascii="Times New Roman" w:hAnsi="Times New Roman" w:cs="Times New Roman"/>
+        </w:rPr>
+        <w:fldChar w:fldCharType="end"/>
+      </w:r>
+      <w:r>
+        <w:rPr>
+          <w:rFonts w:ascii="Times New Roman" w:hAnsi="Times New Roman" w:cs="Times New Roman"/>
+        </w:rPr>
+        <w:t xml:space="preserve">: </w:t>
+      </w:r>
+      <w:r>
+        <w:rPr>
+          <w:rFonts w:ascii="Times New Roman" w:hAnsi="Times New Roman" w:cs="Times New Roman"/>
+        </w:rPr>
+        <w:t>TO-BE model poslovnog procesa tehničke inspekcije korištenjem sistema DroneInspect</w:t>
+      </w:r>
+      <w:bookmarkEnd w:id="40"/>
+    </w:p>
+    <w:p>
+      <w:pPr>
+        <w:spacing w:line="276" w:lineRule="auto"/>
+        <w:jc w:val="both"/>
+        <w:rPr>
+          <w:rFonts w:ascii="Times New Roman" w:hAnsi="Times New Roman" w:cs="Times New Roman"/>
+        </w:rPr>
+      </w:pPr>
+      <w:r>
+        <w:rPr>
+          <w:rFonts w:ascii="Times New Roman" w:hAnsi="Times New Roman" w:cs="Times New Roman"/>
+        </w:rPr>
+        <w:lastRenderedPageBreak/>
+        <w:t>Prikazani model predstavlja predloženi tok poslovnog procesa nakon uvođenja informacionog sistema DroneInspect. Proces započinje podnošenjem zahtjeva klijenta, nakon čega slijede provjera potpunosti zahtjeva, planiranje inspekcije, raspoređivanje resursa, prikupljanje i obrada snimljenog materijala te evidentiranje tehničkih nalaza. Sistem omogućava centralizovano upravljanje zahtjevima, automatsku provjeru raspoloživosti resursa, AI podršku pri kategorizaciji mogućih oštećenja i generisanje nacrta završnog izvještaja. Stručna provjera nalaza i potvrđivanje izvještaja ostaju u nadležnosti tehničkog inspektora. Proces završava pohranom potvrđenog izvještaja i njegovim dostavljanjem klijentu.</w:t>
       </w:r>
     </w:p>
     <w:p>
@@ -21478,7 +22032,7 @@
           <w:szCs w:val="28"/>
         </w:rPr>
       </w:pPr>
-      <w:bookmarkStart w:id="39" w:name="_Toc243883917"/>
+      <w:bookmarkStart w:id="41" w:name="_Toc243883917"/>
       <w:r>
         <w:rPr>
           <w:rFonts w:ascii="Times New Roman" w:hAnsi="Times New Roman" w:cs="Times New Roman"/>
@@ -21509,7 +22063,7 @@
         </w:rPr>
         <w:t>istema</w:t>
       </w:r>
-      <w:bookmarkEnd w:id="39"/>
+      <w:bookmarkEnd w:id="41"/>
     </w:p>
     <w:p>
       <w:pPr>
@@ -21526,7 +22080,7 @@
           <w:bCs/>
         </w:rPr>
       </w:pPr>
-      <w:bookmarkStart w:id="40" w:name="_Toc243883918"/>
+      <w:bookmarkStart w:id="42" w:name="_Toc243883918"/>
       <w:r>
         <w:rPr>
           <w:rFonts w:ascii="Times New Roman" w:hAnsi="Times New Roman" w:cs="Times New Roman"/>
@@ -21535,7 +22089,7 @@
         </w:rPr>
         <w:t>Evidencija klijenata, objekata i zahtjeva za inspekciju</w:t>
       </w:r>
-      <w:bookmarkEnd w:id="40"/>
+      <w:bookmarkEnd w:id="42"/>
     </w:p>
     <w:p>
       <w:pPr>
@@ -21579,7 +22133,6 @@
         <w:rPr>
           <w:rFonts w:ascii="Times New Roman" w:hAnsi="Times New Roman" w:cs="Times New Roman"/>
         </w:rPr>
-        <w:lastRenderedPageBreak/>
         <w:t>Svakom zahtjevu dodjeljivat će se jedinstvena oznaka i odgovarajući status.</w:t>
       </w:r>
     </w:p>
@@ -21613,7 +22166,7 @@
           <w:bCs/>
         </w:rPr>
       </w:pPr>
-      <w:bookmarkStart w:id="41" w:name="_Toc243883919"/>
+      <w:bookmarkStart w:id="43" w:name="_Toc243883919"/>
       <w:r>
         <w:rPr>
           <w:rFonts w:ascii="Times New Roman" w:hAnsi="Times New Roman" w:cs="Times New Roman"/>
@@ -21622,7 +22175,7 @@
         </w:rPr>
         <w:t>Planiranje i raspoređivanje inspekcija</w:t>
       </w:r>
-      <w:bookmarkEnd w:id="41"/>
+      <w:bookmarkEnd w:id="43"/>
     </w:p>
     <w:p>
       <w:pPr>
@@ -21699,7 +22252,7 @@
           <w:bCs/>
         </w:rPr>
       </w:pPr>
-      <w:bookmarkStart w:id="42" w:name="_Toc243883920"/>
+      <w:bookmarkStart w:id="44" w:name="_Toc243883920"/>
       <w:r>
         <w:rPr>
           <w:rFonts w:ascii="Times New Roman" w:hAnsi="Times New Roman" w:cs="Times New Roman"/>
@@ -21708,7 +22261,7 @@
         </w:rPr>
         <w:t>Evidencija realizacije inspekcija</w:t>
       </w:r>
-      <w:bookmarkEnd w:id="42"/>
+      <w:bookmarkEnd w:id="44"/>
     </w:p>
     <w:p>
       <w:pPr>
@@ -21737,6 +22290,7 @@
         <w:rPr>
           <w:rFonts w:ascii="Times New Roman" w:hAnsi="Times New Roman" w:cs="Times New Roman"/>
         </w:rPr>
+        <w:lastRenderedPageBreak/>
         <w:t>Nakon obavljenog terenskog pregleda operater će evidentirati realizaciju inspekcije i učitati prikupljene fotografije i videozapise, koji će biti povezani s odgovarajućim zapisom.</w:t>
       </w:r>
     </w:p>
@@ -21770,7 +22324,7 @@
           <w:bCs/>
         </w:rPr>
       </w:pPr>
-      <w:bookmarkStart w:id="43" w:name="_Toc243883921"/>
+      <w:bookmarkStart w:id="45" w:name="_Toc243883921"/>
       <w:r>
         <w:rPr>
           <w:rFonts w:ascii="Times New Roman" w:hAnsi="Times New Roman" w:cs="Times New Roman"/>
@@ -21779,7 +22333,7 @@
         </w:rPr>
         <w:t>Upravljanje fotografijama i videozapisima</w:t>
       </w:r>
-      <w:bookmarkEnd w:id="43"/>
+      <w:bookmarkEnd w:id="45"/>
     </w:p>
     <w:p>
       <w:pPr>
@@ -21856,17 +22410,16 @@
           <w:bCs/>
         </w:rPr>
       </w:pPr>
-      <w:bookmarkStart w:id="44" w:name="_Toc243883922"/>
+      <w:bookmarkStart w:id="46" w:name="_Toc243883922"/>
       <w:r>
         <w:rPr>
           <w:rFonts w:ascii="Times New Roman" w:hAnsi="Times New Roman" w:cs="Times New Roman"/>
           <w:b/>
           <w:bCs/>
         </w:rPr>
-        <w:lastRenderedPageBreak/>
         <w:t>AI podrška pri kategorizaciji fotografija</w:t>
       </w:r>
-      <w:bookmarkEnd w:id="44"/>
+      <w:bookmarkEnd w:id="46"/>
     </w:p>
     <w:p>
       <w:pPr>
@@ -21973,7 +22526,7 @@
           <w:bCs/>
         </w:rPr>
       </w:pPr>
-      <w:bookmarkStart w:id="45" w:name="_Toc243883923"/>
+      <w:bookmarkStart w:id="47" w:name="_Toc243883923"/>
       <w:r>
         <w:rPr>
           <w:rFonts w:ascii="Times New Roman" w:hAnsi="Times New Roman" w:cs="Times New Roman"/>
@@ -21982,7 +22535,7 @@
         </w:rPr>
         <w:t>Evidencija tehničkih nalaza i generisanje završnih izvještaja</w:t>
       </w:r>
-      <w:bookmarkEnd w:id="45"/>
+      <w:bookmarkEnd w:id="47"/>
     </w:p>
     <w:p>
       <w:pPr>
@@ -22011,6 +22564,7 @@
         <w:rPr>
           <w:rFonts w:ascii="Times New Roman" w:hAnsi="Times New Roman" w:cs="Times New Roman"/>
         </w:rPr>
+        <w:lastRenderedPageBreak/>
         <w:t>Na osnovu pregleda prikupljenog materijala moći će evidentirati uočena oštećenja i druge relevantne nalaze. Svaki nalaz sadržavat će opis i mogućnost povezivanja s fotografijama ili drugim materijalom koji ga dokumentuje.</w:t>
       </w:r>
     </w:p>
@@ -22089,17 +22643,16 @@
           <w:bCs/>
         </w:rPr>
       </w:pPr>
-      <w:bookmarkStart w:id="46" w:name="_Toc243883924"/>
+      <w:bookmarkStart w:id="48" w:name="_Toc243883924"/>
       <w:r>
         <w:rPr>
           <w:rFonts w:ascii="Times New Roman" w:hAnsi="Times New Roman" w:cs="Times New Roman"/>
           <w:b/>
           <w:bCs/>
         </w:rPr>
-        <w:lastRenderedPageBreak/>
         <w:t>Praćenje statusa i obavještavanje klijenata</w:t>
       </w:r>
-      <w:bookmarkEnd w:id="46"/>
+      <w:bookmarkEnd w:id="48"/>
     </w:p>
     <w:p>
       <w:pPr>
@@ -22191,7 +22744,7 @@
           <w:bCs/>
         </w:rPr>
       </w:pPr>
-      <w:bookmarkStart w:id="47" w:name="_Toc243883925"/>
+      <w:bookmarkStart w:id="49" w:name="_Toc243883925"/>
       <w:r>
         <w:rPr>
           <w:rFonts w:ascii="Times New Roman" w:hAnsi="Times New Roman" w:cs="Times New Roman"/>
@@ -22200,7 +22753,7 @@
         </w:rPr>
         <w:t>Upravljanje korisnicima i evidencija aktivnosti</w:t>
       </w:r>
-      <w:bookmarkEnd w:id="47"/>
+      <w:bookmarkEnd w:id="49"/>
     </w:p>
     <w:p>
       <w:pPr>
@@ -22277,16 +22830,17 @@
           <w:bCs/>
         </w:rPr>
       </w:pPr>
-      <w:bookmarkStart w:id="48" w:name="_Toc243883926"/>
+      <w:bookmarkStart w:id="50" w:name="_Toc243883926"/>
       <w:r>
         <w:rPr>
           <w:rFonts w:ascii="Times New Roman" w:hAnsi="Times New Roman" w:cs="Times New Roman"/>
           <w:b/>
           <w:bCs/>
         </w:rPr>
+        <w:lastRenderedPageBreak/>
         <w:t>Sigurnosne kopije podataka</w:t>
       </w:r>
-      <w:bookmarkEnd w:id="48"/>
+      <w:bookmarkEnd w:id="50"/>
     </w:p>
     <w:p>
       <w:pPr>
@@ -22346,7 +22900,7 @@
           <w:szCs w:val="28"/>
         </w:rPr>
       </w:pPr>
-      <w:bookmarkStart w:id="49" w:name="_Toc243883927"/>
+      <w:bookmarkStart w:id="51" w:name="_Toc243883927"/>
       <w:r>
         <w:rPr>
           <w:rFonts w:ascii="Times New Roman" w:hAnsi="Times New Roman" w:cs="Times New Roman"/>
@@ -22357,7 +22911,7 @@
         </w:rPr>
         <w:t>6.6 Granice sistema</w:t>
       </w:r>
-      <w:bookmarkEnd w:id="49"/>
+      <w:bookmarkEnd w:id="51"/>
     </w:p>
     <w:p>
       <w:pPr>
@@ -22386,7 +22940,6 @@
         <w:rPr>
           <w:rFonts w:ascii="Times New Roman" w:hAnsi="Times New Roman" w:cs="Times New Roman"/>
         </w:rPr>
-        <w:lastRenderedPageBreak/>
         <w:t>Njegov funkcionalni obuhvat određen je aktivnostima potrebnim za zaprimanje zahtjeva klijenata, organizaciju pregleda, evidentiranje prikupljenog materijala, stručnu obradu tehničkih nalaza i dostavljanje završne dokumentacije.</w:t>
       </w:r>
     </w:p>
@@ -22420,7 +22973,7 @@
           <w:bCs/>
         </w:rPr>
       </w:pPr>
-      <w:bookmarkStart w:id="50" w:name="_Toc243883928"/>
+      <w:bookmarkStart w:id="52" w:name="_Toc243883928"/>
       <w:r>
         <w:rPr>
           <w:rFonts w:ascii="Times New Roman" w:hAnsi="Times New Roman" w:cs="Times New Roman"/>
@@ -22445,7 +22998,7 @@
         </w:rPr>
         <w:t>istema</w:t>
       </w:r>
-      <w:bookmarkEnd w:id="50"/>
+      <w:bookmarkEnd w:id="52"/>
     </w:p>
     <w:p>
       <w:pPr>
@@ -22683,6 +23236,7 @@
         <w:rPr>
           <w:rFonts w:ascii="Times New Roman" w:hAnsi="Times New Roman" w:cs="Times New Roman"/>
         </w:rPr>
+        <w:lastRenderedPageBreak/>
         <w:t>Navedene funkcionalnosti čine povezanu cjelinu u kojoj se podaci nastali tokom jedne faze inspekcije koriste i u narednim fazama, bez potrebe za njihovim ponovnim unosom u zasebne evidencije.</w:t>
       </w:r>
     </w:p>
@@ -22701,7 +23255,7 @@
           <w:bCs/>
         </w:rPr>
       </w:pPr>
-      <w:bookmarkStart w:id="51" w:name="_Toc243883929"/>
+      <w:bookmarkStart w:id="53" w:name="_Toc243883929"/>
       <w:r>
         <w:rPr>
           <w:rFonts w:ascii="Times New Roman" w:hAnsi="Times New Roman" w:cs="Times New Roman"/>
@@ -22726,7 +23280,7 @@
         </w:rPr>
         <w:t>istema</w:t>
       </w:r>
-      <w:bookmarkEnd w:id="51"/>
+      <w:bookmarkEnd w:id="53"/>
     </w:p>
     <w:p>
       <w:pPr>
@@ -22818,7 +23372,6 @@
           <w:b/>
           <w:bCs/>
         </w:rPr>
-        <w:lastRenderedPageBreak/>
         <w:t>Razvoj vlastitih AI modela:</w:t>
       </w:r>
       <w:r>
@@ -23028,7 +23581,7 @@
           <w:szCs w:val="28"/>
         </w:rPr>
       </w:pPr>
-      <w:bookmarkStart w:id="52" w:name="_Toc243883930"/>
+      <w:bookmarkStart w:id="54" w:name="_Toc243883930"/>
       <w:r>
         <w:rPr>
           <w:rFonts w:ascii="Times New Roman" w:hAnsi="Times New Roman" w:cs="Times New Roman"/>
@@ -23039,7 +23592,7 @@
         </w:rPr>
         <w:t>Organizacijske i tehničke pretpostavke</w:t>
       </w:r>
-      <w:bookmarkEnd w:id="52"/>
+      <w:bookmarkEnd w:id="54"/>
     </w:p>
     <w:p>
       <w:pPr>
@@ -23083,6 +23636,7 @@
         <w:rPr>
           <w:rFonts w:ascii="Times New Roman" w:hAnsi="Times New Roman" w:cs="Times New Roman"/>
         </w:rPr>
+        <w:lastRenderedPageBreak/>
         <w:t>Sistem će se oslanjati na podatke koje unose ovlašteni korisnici, kao i na fotografije i videozapise nastale tokom stvarnih ili simuliranih tehničkih inspekcija.</w:t>
       </w:r>
     </w:p>
@@ -23143,7 +23697,6 @@
         <w:rPr>
           <w:rFonts w:ascii="Times New Roman" w:hAnsi="Times New Roman" w:cs="Times New Roman"/>
         </w:rPr>
-        <w:lastRenderedPageBreak/>
         <w:t>Ovako definisani zahtjevi i granice predstavljaju osnovu za daljnju analizu, detaljniju specifikaciju funkcionalnosti i projektovanje informacionog sistema DroneInspect.</w:t>
       </w:r>
     </w:p>
@@ -23163,7 +23716,7 @@
           <w:szCs w:val="32"/>
         </w:rPr>
       </w:pPr>
-      <w:bookmarkStart w:id="53" w:name="_Toc243883931"/>
+      <w:bookmarkStart w:id="55" w:name="_Toc243883931"/>
       <w:r>
         <w:rPr>
           <w:rFonts w:ascii="Times New Roman" w:hAnsi="Times New Roman" w:cs="Times New Roman"/>
@@ -23174,7 +23727,7 @@
         </w:rPr>
         <w:t>Ciljevi projekta</w:t>
       </w:r>
-      <w:bookmarkEnd w:id="53"/>
+      <w:bookmarkEnd w:id="55"/>
     </w:p>
     <w:p>
       <w:pPr>
@@ -23192,7 +23745,7 @@
           <w:szCs w:val="28"/>
         </w:rPr>
       </w:pPr>
-      <w:bookmarkStart w:id="54" w:name="_Toc243883932"/>
+      <w:bookmarkStart w:id="56" w:name="_Toc243883932"/>
       <w:r>
         <w:rPr>
           <w:rFonts w:ascii="Times New Roman" w:hAnsi="Times New Roman" w:cs="Times New Roman"/>
@@ -23203,7 +23756,7 @@
         </w:rPr>
         <w:t>Glavni cilj projekta</w:t>
       </w:r>
-      <w:bookmarkEnd w:id="54"/>
+      <w:bookmarkEnd w:id="56"/>
     </w:p>
     <w:p>
       <w:pPr>
@@ -23297,7 +23850,7 @@
           <w:szCs w:val="28"/>
         </w:rPr>
       </w:pPr>
-      <w:bookmarkStart w:id="55" w:name="_Toc243883933"/>
+      <w:bookmarkStart w:id="57" w:name="_Toc243883933"/>
       <w:r>
         <w:rPr>
           <w:rFonts w:ascii="Times New Roman" w:eastAsia="Times New Roman" w:hAnsi="Times New Roman" w:cs="Times New Roman"/>
@@ -23308,7 +23861,7 @@
         </w:rPr>
         <w:t>Specifični ciljevi projekta</w:t>
       </w:r>
-      <w:bookmarkEnd w:id="55"/>
+      <w:bookmarkEnd w:id="57"/>
     </w:p>
     <w:p>
       <w:pPr>
@@ -23372,6 +23925,7 @@
           <w:kern w:val="0"/>
           <w14:ligatures w14:val="none"/>
         </w:rPr>
+        <w:lastRenderedPageBreak/>
         <w:t>Omogućiti efikasnije planiranje termina inspekcija i raspoređivanje operatera dronova i raspoložive opreme, uz provjeru mogućih preklapanja.</w:t>
       </w:r>
     </w:p>
@@ -23487,7 +24041,6 @@
           <w:kern w:val="0"/>
           <w14:ligatures w14:val="none"/>
         </w:rPr>
-        <w:lastRenderedPageBreak/>
         <w:t>Integrisati AI komponentu koja omogućava preliminarnu kategorizaciju mogućih oštećenja na fotografijama, uz mogućnost prihvatanja, izmjene ili odbacivanja predloženih rezultata od strane tehničkog inspektora.</w:t>
       </w:r>
     </w:p>
@@ -23622,7 +24175,7 @@
           <w:szCs w:val="28"/>
         </w:rPr>
       </w:pPr>
-      <w:bookmarkStart w:id="56" w:name="_Toc243883934"/>
+      <w:bookmarkStart w:id="58" w:name="_Toc243883934"/>
       <w:r>
         <w:rPr>
           <w:rFonts w:ascii="Times New Roman" w:eastAsia="Times New Roman" w:hAnsi="Times New Roman" w:cs="Times New Roman"/>
@@ -23633,7 +24186,7 @@
         </w:rPr>
         <w:t>Mjerljivi ciljevi projekta</w:t>
       </w:r>
-      <w:bookmarkEnd w:id="56"/>
+      <w:bookmarkEnd w:id="58"/>
     </w:p>
     <w:p>
       <w:pPr>
@@ -23790,6 +24343,7 @@
           <w:kern w:val="0"/>
           <w14:ligatures w14:val="none"/>
         </w:rPr>
+        <w:lastRenderedPageBreak/>
         <w:t>Kao pokazatelj efikasnosti predviđa se pronalaženje kompletne dokumentacije odabrane inspekcije za manje od dvije minute u najmanje 90% testiranih slučajeva.</w:t>
       </w:r>
     </w:p>
@@ -23870,7 +24424,6 @@
           <w:kern w:val="0"/>
           <w14:ligatures w14:val="none"/>
         </w:rPr>
-        <w:lastRenderedPageBreak/>
         <w:t>Implementirati i testirati AI podršku za preliminarnu kategorizaciju mogućih oštećenja na unaprijed odabranom skupu testnih fotografija.</w:t>
       </w:r>
     </w:p>
@@ -24086,6 +24639,7 @@
           <w:kern w:val="0"/>
           <w14:ligatures w14:val="none"/>
         </w:rPr>
+        <w:lastRenderedPageBreak/>
         <w:t>Navedeni ciljevi predstavljaju kriterije za procjenu uspješnosti implementacije osnovne verzije sistema DroneInspect.</w:t>
       </w:r>
     </w:p>
@@ -24124,7 +24678,7 @@
           <w:szCs w:val="28"/>
         </w:rPr>
       </w:pPr>
-      <w:bookmarkStart w:id="57" w:name="_Toc243883935"/>
+      <w:bookmarkStart w:id="59" w:name="_Toc243883935"/>
       <w:r>
         <w:rPr>
           <w:rFonts w:ascii="Times New Roman" w:eastAsia="Times New Roman" w:hAnsi="Times New Roman" w:cs="Times New Roman"/>
@@ -24135,7 +24689,7 @@
         </w:rPr>
         <w:t>Očekivani rezultati projekta</w:t>
       </w:r>
-      <w:bookmarkEnd w:id="57"/>
+      <w:bookmarkEnd w:id="59"/>
     </w:p>
     <w:p>
       <w:pPr>
@@ -24172,7 +24726,6 @@
           <w:kern w:val="0"/>
           <w14:ligatures w14:val="none"/>
         </w:rPr>
-        <w:lastRenderedPageBreak/>
         <w:t>Realizacijom projekta očekuju se sljedeći rezultati:</w:t>
       </w:r>
     </w:p>
@@ -24460,7 +25013,7 @@
           <w:szCs w:val="32"/>
         </w:rPr>
       </w:pPr>
-      <w:bookmarkStart w:id="58" w:name="_Toc243883936"/>
+      <w:bookmarkStart w:id="60" w:name="_Toc243883936"/>
       <w:r>
         <w:rPr>
           <w:rFonts w:ascii="Times New Roman" w:hAnsi="Times New Roman" w:cs="Times New Roman"/>
@@ -24471,7 +25024,7 @@
         </w:rPr>
         <w:t>Analiza izvedivosti</w:t>
       </w:r>
-      <w:bookmarkEnd w:id="58"/>
+      <w:bookmarkEnd w:id="60"/>
     </w:p>
     <w:p>
       <w:pPr>
@@ -24500,7 +25053,14 @@
         <w:rPr>
           <w:rFonts w:ascii="Times New Roman" w:hAnsi="Times New Roman" w:cs="Times New Roman"/>
         </w:rPr>
-        <w:t>Budući da se projekat zasniva na hipotetičkoj kompaniji, procjene su preliminarne i temelje se na definisanim poslovnim procesima, funkcionalnim zahtjevima i jasno navedenim pretpostavkama. Rezultati analiza predstavljaju osnovu za donošenje projektne odluke i prepoznavanje rizika koje je potrebno uzeti u obzir tokom daljnjeg razvoja.</w:t>
+        <w:t xml:space="preserve">Budući da se projekat zasniva na hipotetičkoj kompaniji, procjene su preliminarne i temelje se na definisanim poslovnim procesima, funkcionalnim zahtjevima i jasno navedenim pretpostavkama. </w:t>
+      </w:r>
+      <w:r>
+        <w:rPr>
+          <w:rFonts w:ascii="Times New Roman" w:hAnsi="Times New Roman" w:cs="Times New Roman"/>
+        </w:rPr>
+        <w:lastRenderedPageBreak/>
+        <w:t>Rezultati analiza predstavljaju osnovu za donošenje projektne odluke i prepoznavanje rizika koje je potrebno uzeti u obzir tokom daljnjeg razvoja.</w:t>
       </w:r>
     </w:p>
     <w:p>
@@ -24519,7 +25079,7 @@
           <w:szCs w:val="28"/>
         </w:rPr>
       </w:pPr>
-      <w:bookmarkStart w:id="59" w:name="_Toc243883937"/>
+      <w:bookmarkStart w:id="61" w:name="_Toc243883937"/>
       <w:r>
         <w:rPr>
           <w:rFonts w:ascii="Times New Roman" w:hAnsi="Times New Roman" w:cs="Times New Roman"/>
@@ -24530,7 +25090,7 @@
         </w:rPr>
         <w:t>Analiza tehničke izvedivosti</w:t>
       </w:r>
-      <w:bookmarkEnd w:id="59"/>
+      <w:bookmarkEnd w:id="61"/>
     </w:p>
     <w:p>
       <w:pPr>
@@ -24546,7 +25106,7 @@
           <w:bCs/>
         </w:rPr>
       </w:pPr>
-      <w:bookmarkStart w:id="60" w:name="_Toc243883938"/>
+      <w:bookmarkStart w:id="62" w:name="_Toc243883938"/>
       <w:r>
         <w:rPr>
           <w:rFonts w:ascii="Times New Roman" w:hAnsi="Times New Roman" w:cs="Times New Roman"/>
@@ -24571,7 +25131,7 @@
         </w:rPr>
         <w:t>istema</w:t>
       </w:r>
-      <w:bookmarkEnd w:id="60"/>
+      <w:bookmarkEnd w:id="62"/>
     </w:p>
     <w:p>
       <w:pPr>
@@ -24600,7 +25160,6 @@
         <w:rPr>
           <w:rFonts w:ascii="Times New Roman" w:hAnsi="Times New Roman" w:cs="Times New Roman"/>
         </w:rPr>
-        <w:lastRenderedPageBreak/>
         <w:t>Na osnovu definisanih funkcionalnih zahtjeva, razvoj osnovnih funkcionalnosti sistema DroneInspect smatra se tehnički izvedivim. Evidencija klijenata i inspekcija, planiranje termina, upravljanje korisničkim ulogama, praćenje statusa i generisanje izvještaja mogu se realizovati korištenjem postojećih tehnologija za razvoj web aplikacija.</w:t>
       </w:r>
     </w:p>
@@ -24633,7 +25192,7 @@
           <w:bCs/>
         </w:rPr>
       </w:pPr>
-      <w:bookmarkStart w:id="61" w:name="_Toc243883939"/>
+      <w:bookmarkStart w:id="63" w:name="_Toc243883939"/>
       <w:r>
         <w:rPr>
           <w:rFonts w:ascii="Times New Roman" w:hAnsi="Times New Roman" w:cs="Times New Roman"/>
@@ -24642,7 +25201,7 @@
         </w:rPr>
         <w:t>Predložena arhitektura i tehnologije</w:t>
       </w:r>
-      <w:bookmarkEnd w:id="61"/>
+      <w:bookmarkEnd w:id="63"/>
     </w:p>
     <w:p>
       <w:pPr>
@@ -24782,6 +25341,7 @@
         <w:rPr>
           <w:rFonts w:ascii="Times New Roman" w:hAnsi="Times New Roman" w:cs="Times New Roman"/>
         </w:rPr>
+        <w:lastRenderedPageBreak/>
         <w:t>Za upravljanje strukturisanim podacima predlaže se relaciona baza podataka PostgreSQL. U njoj bi se čuvali podaci o klijentima, objektima, zahtjevima, inspekcijama, operaterima, dronovima, terminima, tehničkim nalazima i korisničkim aktivnostima.</w:t>
       </w:r>
     </w:p>
@@ -24829,17 +25389,16 @@
           <w:bCs/>
         </w:rPr>
       </w:pPr>
-      <w:bookmarkStart w:id="62" w:name="_Toc243883940"/>
+      <w:bookmarkStart w:id="64" w:name="_Toc243883940"/>
       <w:r>
         <w:rPr>
           <w:rFonts w:ascii="Times New Roman" w:hAnsi="Times New Roman" w:cs="Times New Roman"/>
           <w:b/>
           <w:bCs/>
         </w:rPr>
-        <w:lastRenderedPageBreak/>
         <w:t>Pohrana i upravljanje multimedijalnim sadržajem</w:t>
       </w:r>
-      <w:bookmarkEnd w:id="62"/>
+      <w:bookmarkEnd w:id="64"/>
     </w:p>
     <w:p>
       <w:pPr>
@@ -25055,7 +25614,7 @@
           <w:bCs/>
         </w:rPr>
       </w:pPr>
-      <w:bookmarkStart w:id="63" w:name="_Toc243883941"/>
+      <w:bookmarkStart w:id="65" w:name="_Toc243883941"/>
       <w:r>
         <w:rPr>
           <w:rFonts w:ascii="Times New Roman" w:hAnsi="Times New Roman" w:cs="Times New Roman"/>
@@ -25064,7 +25623,7 @@
         </w:rPr>
         <w:t>Tehnička izvedivost AI komponente</w:t>
       </w:r>
-      <w:bookmarkEnd w:id="63"/>
+      <w:bookmarkEnd w:id="65"/>
     </w:p>
     <w:p>
       <w:pPr>
@@ -25108,6 +25667,7 @@
         <w:rPr>
           <w:rFonts w:ascii="Times New Roman" w:hAnsi="Times New Roman" w:cs="Times New Roman"/>
         </w:rPr>
+        <w:lastRenderedPageBreak/>
         <w:t>Osnovni tehnički izazov predstavlja izbor modela koji može dovoljno pouzdano prepoznavati kategorije relevantne za inspekcije krovova i fasada. Opći modeli za analizu slika ne moraju biti jednako uspješni u prepoznavanju specifičnih građevinskih oštećenja, posebno kada su fotografije snimljene iz različitih uglova ili pri nepovoljnim uslovima osvjetljenja.</w:t>
       </w:r>
     </w:p>
@@ -25138,7 +25698,6 @@
         <w:rPr>
           <w:rFonts w:ascii="Times New Roman" w:hAnsi="Times New Roman" w:cs="Times New Roman"/>
         </w:rPr>
-        <w:lastRenderedPageBreak/>
         <w:t>Predložene kategorije mogu uključivati pukotine, oštećenja krovnog pokrivača i tragove vlage, pri čemu će njihov konačan izbor zavisiti od mogućnosti i rezultata testiranja odabranog modela.</w:t>
       </w:r>
     </w:p>
@@ -25334,7 +25893,7 @@
           <w:bCs/>
         </w:rPr>
       </w:pPr>
-      <w:bookmarkStart w:id="64" w:name="_Toc243883942"/>
+      <w:bookmarkStart w:id="66" w:name="_Toc243883942"/>
       <w:r>
         <w:rPr>
           <w:rFonts w:ascii="Times New Roman" w:hAnsi="Times New Roman" w:cs="Times New Roman"/>
@@ -25343,7 +25902,7 @@
         </w:rPr>
         <w:t>Infrastruktura, dostupnost i sigurnosne kopije</w:t>
       </w:r>
-      <w:bookmarkEnd w:id="64"/>
+      <w:bookmarkEnd w:id="66"/>
     </w:p>
     <w:p>
       <w:pPr>
@@ -25402,6 +25961,7 @@
         <w:rPr>
           <w:rFonts w:ascii="Times New Roman" w:hAnsi="Times New Roman" w:cs="Times New Roman"/>
         </w:rPr>
+        <w:lastRenderedPageBreak/>
         <w:t>Za pouzdan rad sistema potrebno je definisati postupak redovnog sigurnosnog kopiranja baze podataka i važne dokumentacije. U skladu sa zahtjevima sistema, administratoru treba omogućiti pregled osnovnih informacija o statusu sigurnosnih kopija.</w:t>
       </w:r>
     </w:p>
@@ -25432,7 +25992,6 @@
         <w:rPr>
           <w:rFonts w:ascii="Times New Roman" w:hAnsi="Times New Roman" w:cs="Times New Roman"/>
         </w:rPr>
-        <w:lastRenderedPageBreak/>
         <w:t>Konačan izbor infrastrukture zavisit će od tehničkih potreba, procijenjenih troškova i zahtjeva za sigurnost i dostupnost podataka.</w:t>
       </w:r>
     </w:p>
@@ -25450,7 +26009,7 @@
           <w:bCs/>
         </w:rPr>
       </w:pPr>
-      <w:bookmarkStart w:id="65" w:name="_Toc243883943"/>
+      <w:bookmarkStart w:id="67" w:name="_Toc243883943"/>
       <w:r>
         <w:rPr>
           <w:rFonts w:ascii="Times New Roman" w:hAnsi="Times New Roman" w:cs="Times New Roman"/>
@@ -25459,7 +26018,7 @@
         </w:rPr>
         <w:t>Tehnički rizici i ograničenja</w:t>
       </w:r>
-      <w:bookmarkEnd w:id="65"/>
+      <w:bookmarkEnd w:id="67"/>
     </w:p>
     <w:p>
       <w:pPr>
@@ -25644,12 +26203,22 @@
           <w:rFonts w:ascii="Times New Roman" w:hAnsi="Times New Roman" w:cs="Times New Roman"/>
         </w:rPr>
       </w:pPr>
+    </w:p>
+    <w:p>
+      <w:pPr>
+        <w:spacing w:line="276" w:lineRule="auto"/>
+        <w:jc w:val="both"/>
+        <w:rPr>
+          <w:rFonts w:ascii="Times New Roman" w:hAnsi="Times New Roman" w:cs="Times New Roman"/>
+        </w:rPr>
+      </w:pPr>
       <w:r>
         <w:rPr>
           <w:rFonts w:ascii="Times New Roman" w:hAnsi="Times New Roman" w:cs="Times New Roman"/>
           <w:b/>
           <w:bCs/>
         </w:rPr>
+        <w:lastRenderedPageBreak/>
         <w:t>6. Zavisnost od vanjskih servisa</w:t>
       </w:r>
     </w:p>
@@ -25697,17 +26266,16 @@
           <w:bCs/>
         </w:rPr>
       </w:pPr>
-      <w:bookmarkStart w:id="66" w:name="_Toc243883944"/>
+      <w:bookmarkStart w:id="68" w:name="_Toc243883944"/>
       <w:r>
         <w:rPr>
           <w:rFonts w:ascii="Times New Roman" w:hAnsi="Times New Roman" w:cs="Times New Roman"/>
           <w:b/>
           <w:bCs/>
         </w:rPr>
-        <w:lastRenderedPageBreak/>
         <w:t>Zaključna procjena tehničke izvedivosti</w:t>
       </w:r>
-      <w:bookmarkEnd w:id="66"/>
+      <w:bookmarkEnd w:id="68"/>
     </w:p>
     <w:p>
       <w:pPr>
@@ -25800,7 +26368,7 @@
           <w:szCs w:val="28"/>
         </w:rPr>
       </w:pPr>
-      <w:bookmarkStart w:id="67" w:name="_Toc243883945"/>
+      <w:bookmarkStart w:id="69" w:name="_Toc243883945"/>
       <w:r>
         <w:rPr>
           <w:rFonts w:ascii="Times New Roman" w:hAnsi="Times New Roman" w:cs="Times New Roman"/>
@@ -25811,7 +26379,7 @@
         </w:rPr>
         <w:t>Analiza ekonomske izvedivosti</w:t>
       </w:r>
-      <w:bookmarkEnd w:id="67"/>
+      <w:bookmarkEnd w:id="69"/>
     </w:p>
     <w:p>
       <w:pPr>
@@ -25902,16 +26470,17 @@
           <w:bCs/>
         </w:rPr>
       </w:pPr>
-      <w:bookmarkStart w:id="68" w:name="_Toc243883946"/>
+      <w:bookmarkStart w:id="70" w:name="_Toc243883946"/>
       <w:r>
         <w:rPr>
           <w:rFonts w:ascii="Times New Roman" w:hAnsi="Times New Roman" w:cs="Times New Roman"/>
           <w:b/>
           <w:bCs/>
         </w:rPr>
+        <w:lastRenderedPageBreak/>
         <w:t>Procjena troškova projekta</w:t>
       </w:r>
-      <w:bookmarkEnd w:id="68"/>
+      <w:bookmarkEnd w:id="70"/>
     </w:p>
     <w:p>
       <w:pPr>
@@ -25957,7 +26526,6 @@
         <w:rPr>
           <w:rFonts w:ascii="Times New Roman" w:hAnsi="Times New Roman" w:cs="Times New Roman"/>
         </w:rPr>
-        <w:lastRenderedPageBreak/>
         <w:t>Početno ulaganje obuhvata aktivnosti potrebne za analizu, projektovanje, razvoj, testiranje i početno uvođenje informacionog sistema.</w:t>
       </w:r>
     </w:p>
@@ -26519,7 +27087,7 @@
           <w:lang w:val="en-US"/>
         </w:rPr>
       </w:pPr>
-      <w:bookmarkStart w:id="69" w:name="_Toc243881138"/>
+      <w:bookmarkStart w:id="71" w:name="_Toc243881138"/>
       <w:r>
         <w:rPr>
           <w:rFonts w:ascii="Times New Roman" w:hAnsi="Times New Roman" w:cs="Times New Roman"/>
@@ -26563,7 +27131,7 @@
         </w:rPr>
         <w:t>: Procjena početnih troškova razvoja i implementacije sistema DroneInspect</w:t>
       </w:r>
-      <w:bookmarkEnd w:id="69"/>
+      <w:bookmarkEnd w:id="71"/>
     </w:p>
     <w:p>
       <w:pPr>
@@ -26641,6 +27209,24 @@
         </w:rPr>
         <w:t>Pretpostavlja se da će s povećanjem broja inspekcija, količine pohranjenih fotografija i videozapisa te broja AI analiza postepeno rasti troškovi infrastrukture i korištenja vanjskih servisa.</w:t>
       </w:r>
+    </w:p>
+    <w:p>
+      <w:pPr>
+        <w:spacing w:line="276" w:lineRule="auto"/>
+        <w:jc w:val="both"/>
+        <w:rPr>
+          <w:rFonts w:ascii="Times New Roman" w:hAnsi="Times New Roman" w:cs="Times New Roman"/>
+        </w:rPr>
+      </w:pPr>
+    </w:p>
+    <w:p>
+      <w:pPr>
+        <w:spacing w:line="276" w:lineRule="auto"/>
+        <w:jc w:val="both"/>
+        <w:rPr>
+          <w:rFonts w:ascii="Times New Roman" w:hAnsi="Times New Roman" w:cs="Times New Roman"/>
+        </w:rPr>
+      </w:pPr>
     </w:p>
     <w:tbl>
       <w:tblPr>
@@ -26681,6 +27267,7 @@
                 <w:kern w:val="0"/>
                 <w14:ligatures w14:val="none"/>
               </w:rPr>
+              <w:lastRenderedPageBreak/>
               <w:t>Kategorija troška</w:t>
             </w:r>
           </w:p>
@@ -27329,7 +27916,6 @@
                 <w:kern w:val="0"/>
                 <w14:ligatures w14:val="none"/>
               </w:rPr>
-              <w:lastRenderedPageBreak/>
               <w:t>Ukupni operativni troškovi</w:t>
             </w:r>
           </w:p>
@@ -27455,7 +28041,7 @@
           <w:lang w:val="en-US"/>
         </w:rPr>
       </w:pPr>
-      <w:bookmarkStart w:id="70" w:name="_Toc243881139"/>
+      <w:bookmarkStart w:id="72" w:name="_Toc243881139"/>
       <w:r>
         <w:rPr>
           <w:rFonts w:ascii="Times New Roman" w:hAnsi="Times New Roman" w:cs="Times New Roman"/>
@@ -27499,7 +28085,7 @@
         </w:rPr>
         <w:t>: Procjena godišnjih operativnih troškova sistema tokom trogodišnjeg perioda</w:t>
       </w:r>
-      <w:bookmarkEnd w:id="70"/>
+      <w:bookmarkEnd w:id="72"/>
     </w:p>
     <w:p>
       <w:pPr>
@@ -27593,7 +28179,7 @@
           <w:bCs/>
         </w:rPr>
       </w:pPr>
-      <w:bookmarkStart w:id="71" w:name="_Toc243883947"/>
+      <w:bookmarkStart w:id="73" w:name="_Toc243883947"/>
       <w:r>
         <w:rPr>
           <w:rFonts w:ascii="Times New Roman" w:eastAsia="Times New Roman" w:hAnsi="Times New Roman" w:cs="Times New Roman"/>
@@ -27602,7 +28188,7 @@
         </w:rPr>
         <w:t>Procjena koristi projekta</w:t>
       </w:r>
-      <w:bookmarkEnd w:id="71"/>
+      <w:bookmarkEnd w:id="73"/>
     </w:p>
     <w:p>
       <w:pPr>
@@ -27759,6 +28345,7 @@
           <w:kern w:val="0"/>
           <w14:ligatures w14:val="none"/>
         </w:rPr>
+        <w:lastRenderedPageBreak/>
         <w:t>Skraćenje vremena obrade izvještaja za 20%</w:t>
       </w:r>
     </w:p>
@@ -27837,7 +28424,6 @@
           <w:kern w:val="0"/>
           <w14:ligatures w14:val="none"/>
         </w:rPr>
-        <w:lastRenderedPageBreak/>
         <w:t>Jedinstven kalendar s provjerom raspoloživosti operatera i dronova može smanjiti rizik od dvostrukih rezervacija, nepotrebnih promjena termina i dodatnih organizacijskih troškova.</w:t>
       </w:r>
     </w:p>
@@ -28586,7 +29172,7 @@
           <w:lang w:val="en-US"/>
         </w:rPr>
       </w:pPr>
-      <w:bookmarkStart w:id="72" w:name="_Toc243881140"/>
+      <w:bookmarkStart w:id="74" w:name="_Toc243881140"/>
       <w:r>
         <w:rPr>
           <w:rFonts w:ascii="Times New Roman" w:hAnsi="Times New Roman" w:cs="Times New Roman"/>
@@ -28630,7 +29216,7 @@
         </w:rPr>
         <w:t>: Procjena finansijski mjerljivih koristi od uvođenja informacionog sistema</w:t>
       </w:r>
-      <w:bookmarkEnd w:id="72"/>
+      <w:bookmarkEnd w:id="74"/>
     </w:p>
     <w:p>
       <w:pPr>
@@ -28691,6 +29277,7 @@
           <w:b/>
           <w:bCs/>
         </w:rPr>
+        <w:lastRenderedPageBreak/>
         <w:t>2. Neopipljive koristi</w:t>
       </w:r>
     </w:p>
@@ -28770,7 +29357,6 @@
         <w:rPr>
           <w:rFonts w:ascii="Times New Roman" w:hAnsi="Times New Roman" w:cs="Times New Roman"/>
         </w:rPr>
-        <w:lastRenderedPageBreak/>
         <w:t>Centralizovana pohrana, redovne sigurnosne kopije, kontrola pristupa prema korisničkim ulogama i evidencija važnih aktivnosti mogu doprinijeti pouzdanijoj zaštiti podataka i dokumentacije.</w:t>
       </w:r>
     </w:p>
@@ -28867,7 +29453,7 @@
           <w:bCs/>
         </w:rPr>
       </w:pPr>
-      <w:bookmarkStart w:id="73" w:name="_Toc243883948"/>
+      <w:bookmarkStart w:id="75" w:name="_Toc243883948"/>
       <w:r>
         <w:rPr>
           <w:rFonts w:ascii="Times New Roman" w:hAnsi="Times New Roman" w:cs="Times New Roman"/>
@@ -28876,7 +29462,7 @@
         </w:rPr>
         <w:t>Pokazatelji ekonomske isplativosti</w:t>
       </w:r>
-      <w:bookmarkEnd w:id="73"/>
+      <w:bookmarkEnd w:id="75"/>
     </w:p>
     <w:p>
       <w:pPr>
@@ -29723,7 +30309,7 @@
           <w:lang w:val="en-US"/>
         </w:rPr>
       </w:pPr>
-      <w:bookmarkStart w:id="74" w:name="_Toc243881141"/>
+      <w:bookmarkStart w:id="76" w:name="_Toc243881141"/>
       <w:r>
         <w:rPr>
           <w:rFonts w:ascii="Times New Roman" w:hAnsi="Times New Roman" w:cs="Times New Roman"/>
@@ -29767,7 +30353,7 @@
         </w:rPr>
         <w:t>: Pregled procijenjenih novčanih tokova projekta tokom trogodišnjeg perioda</w:t>
       </w:r>
-      <w:bookmarkEnd w:id="74"/>
+      <w:bookmarkEnd w:id="76"/>
     </w:p>
     <w:p>
       <w:pPr>
@@ -29828,6 +30414,7 @@
         <w:rPr>
           <w:rFonts w:ascii="Times New Roman" w:hAnsi="Times New Roman" w:cs="Times New Roman"/>
         </w:rPr>
+        <w:lastRenderedPageBreak/>
         <w:t>ROI = (Ukupne koristi − Ukupni troškovi) / Ukupni troškovi × 100%</w:t>
       </w:r>
     </w:p>
@@ -29890,7 +30477,6 @@
         <w:rPr>
           <w:rFonts w:ascii="Times New Roman" w:hAnsi="Times New Roman" w:cs="Times New Roman"/>
         </w:rPr>
-        <w:lastRenderedPageBreak/>
         <w:t>Ovaj pokazatelj ne uzima u obzir vremensku vrijednost novca niti raspored novčanih tokova, zbog čega se dodatno razmatraju period povrata i neto sadašnja vrijednost.</w:t>
       </w:r>
     </w:p>
@@ -30164,8 +30750,18 @@
         <w:rPr>
           <w:rFonts w:ascii="Times New Roman" w:hAnsi="Times New Roman" w:cs="Times New Roman"/>
         </w:rPr>
+        <w:lastRenderedPageBreak/>
         <w:t>Neto sadašnja vrijednost (NPV) predstavlja zbir diskontovanih neto novčanih tokova projekta, uključujući početno ulaganje kao negativan tok u godini 0.</w:t>
       </w:r>
+    </w:p>
+    <w:p>
+      <w:pPr>
+        <w:spacing w:line="276" w:lineRule="auto"/>
+        <w:jc w:val="both"/>
+        <w:rPr>
+          <w:rFonts w:ascii="Times New Roman" w:hAnsi="Times New Roman" w:cs="Times New Roman"/>
+        </w:rPr>
+      </w:pPr>
     </w:p>
     <w:tbl>
       <w:tblPr>
@@ -30594,7 +31190,6 @@
                 <w:kern w:val="0"/>
                 <w14:ligatures w14:val="none"/>
               </w:rPr>
-              <w:lastRenderedPageBreak/>
               <w:t>Ukupno (NPV)</w:t>
             </w:r>
           </w:p>
@@ -30658,7 +31253,7 @@
           <w14:ligatures w14:val="none"/>
         </w:rPr>
       </w:pPr>
-      <w:bookmarkStart w:id="75" w:name="_Toc243881142"/>
+      <w:bookmarkStart w:id="77" w:name="_Toc243881142"/>
       <w:r>
         <w:rPr>
           <w:rFonts w:ascii="Times New Roman" w:hAnsi="Times New Roman" w:cs="Times New Roman"/>
@@ -30702,7 +31297,7 @@
         </w:rPr>
         <w:t>: Izračun diskontovanih novčanih tokova i neto sadašnje vrijednosti (NPV) uz diskontnu stopu od 10%</w:t>
       </w:r>
-      <w:bookmarkEnd w:id="75"/>
+      <w:bookmarkEnd w:id="77"/>
     </w:p>
     <w:p>
       <w:pPr>
@@ -30833,7 +31428,7 @@
           <w:bCs/>
         </w:rPr>
       </w:pPr>
-      <w:bookmarkStart w:id="76" w:name="_Toc243883949"/>
+      <w:bookmarkStart w:id="78" w:name="_Toc243883949"/>
       <w:r>
         <w:rPr>
           <w:rFonts w:ascii="Times New Roman" w:eastAsia="Times New Roman" w:hAnsi="Times New Roman" w:cs="Times New Roman"/>
@@ -30842,7 +31437,7 @@
         </w:rPr>
         <w:t>Ekonomski rizici i ograničenja</w:t>
       </w:r>
-      <w:bookmarkEnd w:id="76"/>
+      <w:bookmarkEnd w:id="78"/>
     </w:p>
     <w:p>
       <w:pPr>
@@ -30959,6 +31554,7 @@
           <w:kern w:val="0"/>
           <w14:ligatures w14:val="none"/>
         </w:rPr>
+        <w:lastRenderedPageBreak/>
         <w:t>Rizik se može ograničiti kontrolom pokretanja AI analiza, praćenjem potrošnje i postavljanjem odgovarajućih budžetskih ograničenja.</w:t>
       </w:r>
     </w:p>
@@ -31039,7 +31635,6 @@
           <w:kern w:val="0"/>
           <w14:ligatures w14:val="none"/>
         </w:rPr>
-        <w:lastRenderedPageBreak/>
         <w:t>Pretpostavljene uštede vremena i povećanje broja inspekcija možda neće biti ostvareni u planiranom obimu. Na njih utiču stvarna organizacija rada, obim potražnje, prihvatanje sistema i raspoloživost zaposlenih.</w:t>
       </w:r>
     </w:p>
@@ -31095,7 +31690,7 @@
           <w:bCs/>
         </w:rPr>
       </w:pPr>
-      <w:bookmarkStart w:id="77" w:name="_Toc243883950"/>
+      <w:bookmarkStart w:id="79" w:name="_Toc243883950"/>
       <w:r>
         <w:rPr>
           <w:rFonts w:ascii="Times New Roman" w:eastAsia="Times New Roman" w:hAnsi="Times New Roman" w:cs="Times New Roman"/>
@@ -31104,7 +31699,7 @@
         </w:rPr>
         <w:t>Zaključna procjena ekonomske izvedivosti</w:t>
       </w:r>
-      <w:bookmarkEnd w:id="77"/>
+      <w:bookmarkEnd w:id="79"/>
     </w:p>
     <w:p>
       <w:pPr>
@@ -31217,7 +31812,7 @@
           <w:szCs w:val="28"/>
         </w:rPr>
       </w:pPr>
-      <w:bookmarkStart w:id="78" w:name="_Toc243883951"/>
+      <w:bookmarkStart w:id="80" w:name="_Toc243883951"/>
       <w:r>
         <w:rPr>
           <w:rFonts w:ascii="Times New Roman" w:eastAsia="Times New Roman" w:hAnsi="Times New Roman" w:cs="Times New Roman"/>
@@ -31226,9 +31821,10 @@
           <w:sz w:val="28"/>
           <w:szCs w:val="28"/>
         </w:rPr>
+        <w:lastRenderedPageBreak/>
         <w:t>Analiza vremenske izvedivosti</w:t>
       </w:r>
-      <w:bookmarkEnd w:id="78"/>
+      <w:bookmarkEnd w:id="80"/>
     </w:p>
     <w:p>
       <w:pPr>
@@ -31244,7 +31840,7 @@
           <w:bCs/>
         </w:rPr>
       </w:pPr>
-      <w:bookmarkStart w:id="79" w:name="_Toc243883952"/>
+      <w:bookmarkStart w:id="81" w:name="_Toc243883952"/>
       <w:r>
         <w:rPr>
           <w:rFonts w:ascii="Times New Roman" w:eastAsia="Times New Roman" w:hAnsi="Times New Roman" w:cs="Times New Roman"/>
@@ -31253,7 +31849,7 @@
         </w:rPr>
         <w:t>Procjena vremenske izvedivosti projekta</w:t>
       </w:r>
-      <w:bookmarkEnd w:id="79"/>
+      <w:bookmarkEnd w:id="81"/>
     </w:p>
     <w:p>
       <w:pPr>
@@ -31328,7 +31924,6 @@
           <w:kern w:val="0"/>
           <w14:ligatures w14:val="none"/>
         </w:rPr>
-        <w:lastRenderedPageBreak/>
         <w:t>Poseban izazov predstavlja integracija AI komponente i upravljanje multimedijalnim sadržajem, zbog čega je neophodno provjeriti njihovu tehničku izvodljivost dovoljno rano u realizaciji.</w:t>
       </w:r>
     </w:p>
@@ -31365,7 +31960,7 @@
           <w:bCs/>
         </w:rPr>
       </w:pPr>
-      <w:bookmarkStart w:id="80" w:name="_Toc243883953"/>
+      <w:bookmarkStart w:id="82" w:name="_Toc243883953"/>
       <w:r>
         <w:rPr>
           <w:rFonts w:ascii="Times New Roman" w:eastAsia="Times New Roman" w:hAnsi="Times New Roman" w:cs="Times New Roman"/>
@@ -31374,7 +31969,7 @@
         </w:rPr>
         <w:t>Plan realizacije projekta po fazama</w:t>
       </w:r>
-      <w:bookmarkEnd w:id="80"/>
+      <w:bookmarkEnd w:id="82"/>
     </w:p>
     <w:p>
       <w:pPr>
@@ -31969,7 +32564,16 @@
                 <w:kern w:val="0"/>
                 <w14:ligatures w14:val="none"/>
               </w:rPr>
-              <w:t>Integracija multimedije, AI komponente i izvještaja</w:t>
+              <w:t xml:space="preserve">Integracija multimedije, AI </w:t>
+            </w:r>
+            <w:r>
+              <w:rPr>
+                <w:rFonts w:ascii="Times New Roman" w:eastAsia="Times New Roman" w:hAnsi="Times New Roman" w:cs="Times New Roman"/>
+                <w:kern w:val="0"/>
+                <w14:ligatures w14:val="none"/>
+              </w:rPr>
+              <w:lastRenderedPageBreak/>
+              <w:t>komponente i izvještaja</w:t>
             </w:r>
           </w:p>
         </w:tc>
@@ -31993,7 +32597,17 @@
                 <w:kern w:val="0"/>
                 <w14:ligatures w14:val="none"/>
               </w:rPr>
-              <w:t>Pohrana snimaka, integracija odabranog AI rješenja, evidentiranje nalaza i generisanje PDF izvještaja</w:t>
+              <w:lastRenderedPageBreak/>
+              <w:t xml:space="preserve">Pohrana snimaka, integracija odabranog AI rješenja, </w:t>
+            </w:r>
+            <w:r>
+              <w:rPr>
+                <w:rFonts w:ascii="Times New Roman" w:eastAsia="Times New Roman" w:hAnsi="Times New Roman" w:cs="Times New Roman"/>
+                <w:kern w:val="0"/>
+                <w14:ligatures w14:val="none"/>
+              </w:rPr>
+              <w:lastRenderedPageBreak/>
+              <w:t>evidentiranje nalaza i generisanje PDF izvještaja</w:t>
             </w:r>
           </w:p>
         </w:tc>
@@ -32017,6 +32631,7 @@
                 <w:kern w:val="0"/>
                 <w14:ligatures w14:val="none"/>
               </w:rPr>
+              <w:lastRenderedPageBreak/>
               <w:t>2 sedmice</w:t>
             </w:r>
           </w:p>
@@ -32306,7 +32921,7 @@
           <w14:ligatures w14:val="none"/>
         </w:rPr>
       </w:pPr>
-      <w:bookmarkStart w:id="81" w:name="_Toc243881143"/>
+      <w:bookmarkStart w:id="83" w:name="_Toc243881143"/>
       <w:r>
         <w:rPr>
           <w:rFonts w:ascii="Times New Roman" w:hAnsi="Times New Roman" w:cs="Times New Roman"/>
@@ -32350,7 +32965,7 @@
         </w:rPr>
         <w:t>: Plan realizacije projekta DroneInspect po fazama i vremenskim okvirima</w:t>
       </w:r>
-      <w:bookmarkEnd w:id="81"/>
+      <w:bookmarkEnd w:id="83"/>
     </w:p>
     <w:p>
       <w:pPr>
@@ -32368,7 +32983,6 @@
           <w:kern w:val="0"/>
           <w14:ligatures w14:val="none"/>
         </w:rPr>
-        <w:lastRenderedPageBreak/>
         <w:t>Predloženi raspored predstavlja okvirni plan realizacije. Pojedine aktivnosti mogu se provoditi paralelno, posebno izrada korisničkog interfejsa, serverske aplikacije, baze podataka i testiranje AI rješenja.</w:t>
       </w:r>
     </w:p>
@@ -32405,7 +33019,7 @@
           <w:bCs/>
         </w:rPr>
       </w:pPr>
-      <w:bookmarkStart w:id="82" w:name="_Toc243883954"/>
+      <w:bookmarkStart w:id="84" w:name="_Toc243883954"/>
       <w:r>
         <w:rPr>
           <w:rFonts w:ascii="Times New Roman" w:eastAsia="Times New Roman" w:hAnsi="Times New Roman" w:cs="Times New Roman"/>
@@ -32414,7 +33028,7 @@
         </w:rPr>
         <w:t>Faktori koji podržavaju vremensku izvedivost</w:t>
       </w:r>
-      <w:bookmarkEnd w:id="82"/>
+      <w:bookmarkEnd w:id="84"/>
     </w:p>
     <w:p>
       <w:pPr>
@@ -32571,6 +33185,7 @@
           <w:kern w:val="0"/>
           <w14:ligatures w14:val="none"/>
         </w:rPr>
+        <w:lastRenderedPageBreak/>
         <w:t>Tim od 11 članova omogućava raspodjelu zadataka i paralelno izvođenje pojedinih aktivnosti, poput razvoja korisničkog interfejsa, serverske aplikacije, baze podataka i testiranja.</w:t>
       </w:r>
     </w:p>
@@ -32670,7 +33285,6 @@
           <w:kern w:val="0"/>
           <w14:ligatures w14:val="none"/>
         </w:rPr>
-        <w:lastRenderedPageBreak/>
         <w:t>5. Rana provjera AI komponente</w:t>
       </w:r>
     </w:p>
@@ -32726,7 +33340,7 @@
           <w:bCs/>
         </w:rPr>
       </w:pPr>
-      <w:bookmarkStart w:id="83" w:name="_Toc243883955"/>
+      <w:bookmarkStart w:id="85" w:name="_Toc243883955"/>
       <w:r>
         <w:rPr>
           <w:rFonts w:ascii="Times New Roman" w:eastAsia="Times New Roman" w:hAnsi="Times New Roman" w:cs="Times New Roman"/>
@@ -32735,7 +33349,7 @@
         </w:rPr>
         <w:t>Vremenski rizici i mjere ublažavanja</w:t>
       </w:r>
-      <w:bookmarkEnd w:id="83"/>
+      <w:bookmarkEnd w:id="85"/>
     </w:p>
     <w:p>
       <w:pPr>
@@ -33200,7 +33814,16 @@
                 <w:kern w:val="0"/>
                 <w14:ligatures w14:val="none"/>
               </w:rPr>
-              <w:t>Neusklađenost korisničkog interfejsa, serverske aplikacije, baze podataka ili vanjskih servisa može produžiti testiranje</w:t>
+              <w:t xml:space="preserve">Neusklađenost korisničkog interfejsa, serverske aplikacije, baze </w:t>
+            </w:r>
+            <w:r>
+              <w:rPr>
+                <w:rFonts w:ascii="Times New Roman" w:eastAsia="Times New Roman" w:hAnsi="Times New Roman" w:cs="Times New Roman"/>
+                <w:kern w:val="0"/>
+                <w14:ligatures w14:val="none"/>
+              </w:rPr>
+              <w:lastRenderedPageBreak/>
+              <w:t>podataka ili vanjskih servisa može produžiti testiranje</w:t>
             </w:r>
           </w:p>
         </w:tc>
@@ -33225,7 +33848,17 @@
                 <w:kern w:val="0"/>
                 <w14:ligatures w14:val="none"/>
               </w:rPr>
-              <w:t>Postepena integracija, rano testiranje povezivanja i redovna provjera međusobne kompatibilnosti</w:t>
+              <w:lastRenderedPageBreak/>
+              <w:t xml:space="preserve">Postepena integracija, rano testiranje povezivanja i redovna </w:t>
+            </w:r>
+            <w:r>
+              <w:rPr>
+                <w:rFonts w:ascii="Times New Roman" w:eastAsia="Times New Roman" w:hAnsi="Times New Roman" w:cs="Times New Roman"/>
+                <w:kern w:val="0"/>
+                <w14:ligatures w14:val="none"/>
+              </w:rPr>
+              <w:lastRenderedPageBreak/>
+              <w:t>provjera međusobne kompatibilnosti</w:t>
             </w:r>
           </w:p>
         </w:tc>
@@ -33244,11 +33877,12 @@
           <w14:ligatures w14:val="none"/>
         </w:rPr>
       </w:pPr>
-      <w:bookmarkStart w:id="84" w:name="_Toc243881144"/>
-      <w:r>
-        <w:rPr>
-          <w:rFonts w:ascii="Times New Roman" w:hAnsi="Times New Roman" w:cs="Times New Roman"/>
-        </w:rPr>
+      <w:bookmarkStart w:id="86" w:name="_Toc243881144"/>
+      <w:r>
+        <w:rPr>
+          <w:rFonts w:ascii="Times New Roman" w:hAnsi="Times New Roman" w:cs="Times New Roman"/>
+        </w:rPr>
+        <w:lastRenderedPageBreak/>
         <w:t xml:space="preserve">Tabela </w:t>
       </w:r>
       <w:r>
@@ -33288,7 +33922,7 @@
         </w:rPr>
         <w:t>: Vremenski rizici projekta i predložene mjere njihovog ublažavanja</w:t>
       </w:r>
-      <w:bookmarkEnd w:id="84"/>
+      <w:bookmarkEnd w:id="86"/>
     </w:p>
     <w:p>
       <w:pPr>
@@ -33323,7 +33957,7 @@
           <w:bCs/>
         </w:rPr>
       </w:pPr>
-      <w:bookmarkStart w:id="85" w:name="_Toc243883956"/>
+      <w:bookmarkStart w:id="87" w:name="_Toc243883956"/>
       <w:r>
         <w:rPr>
           <w:rFonts w:ascii="Times New Roman" w:eastAsia="Times New Roman" w:hAnsi="Times New Roman" w:cs="Times New Roman"/>
@@ -33332,7 +33966,7 @@
         </w:rPr>
         <w:t>Zaključna procjena vremenske izvedivosti</w:t>
       </w:r>
-      <w:bookmarkEnd w:id="85"/>
+      <w:bookmarkEnd w:id="87"/>
     </w:p>
     <w:p>
       <w:pPr>
@@ -33369,7 +34003,6 @@
           <w:kern w:val="0"/>
           <w14:ligatures w14:val="none"/>
         </w:rPr>
-        <w:lastRenderedPageBreak/>
         <w:t>Raspoloživost tima od 11 članova omogućava paralelno izvođenje dijela aktivnosti, dok korištenje postojećih tehnologija može smanjiti trajanje implementacije.</w:t>
       </w:r>
     </w:p>
@@ -33446,7 +34079,7 @@
           <w:szCs w:val="28"/>
         </w:rPr>
       </w:pPr>
-      <w:bookmarkStart w:id="86" w:name="_Toc243883957"/>
+      <w:bookmarkStart w:id="88" w:name="_Toc243883957"/>
       <w:r>
         <w:rPr>
           <w:rFonts w:ascii="Times New Roman" w:eastAsia="Times New Roman" w:hAnsi="Times New Roman" w:cs="Times New Roman"/>
@@ -33457,7 +34090,7 @@
         </w:rPr>
         <w:t>Analiza operativne izvedivosti</w:t>
       </w:r>
-      <w:bookmarkEnd w:id="86"/>
+      <w:bookmarkEnd w:id="88"/>
     </w:p>
     <w:p>
       <w:pPr>
@@ -33532,6 +34165,7 @@
           <w:kern w:val="0"/>
           <w14:ligatures w14:val="none"/>
         </w:rPr>
+        <w:lastRenderedPageBreak/>
         <w:t>Uvođenjem DroneInspecta ove aktivnosti bile bi objedinjene unutar jedinstvenog informacionog sistema. Takva promjena može pojednostaviti pristup informacijama i smanjiti potrebu za ručnim usklađivanjem podataka, ali istovremeno zahtijeva prilagođavanje zaposlenih novom načinu rada.</w:t>
       </w:r>
     </w:p>
@@ -33549,7 +34183,7 @@
           <w:bCs/>
         </w:rPr>
       </w:pPr>
-      <w:bookmarkStart w:id="87" w:name="_Toc243883958"/>
+      <w:bookmarkStart w:id="89" w:name="_Toc243883958"/>
       <w:r>
         <w:rPr>
           <w:rFonts w:ascii="Times New Roman" w:eastAsia="Times New Roman" w:hAnsi="Times New Roman" w:cs="Times New Roman"/>
@@ -33558,7 +34192,7 @@
         </w:rPr>
         <w:t>Uticaj sistema na svakodnevne poslovne procese</w:t>
       </w:r>
-      <w:bookmarkEnd w:id="87"/>
+      <w:bookmarkEnd w:id="89"/>
     </w:p>
     <w:p>
       <w:pPr>
@@ -33655,7 +34289,6 @@
           <w:kern w:val="0"/>
           <w14:ligatures w14:val="none"/>
         </w:rPr>
-        <w:lastRenderedPageBreak/>
         <w:t>Tehnički inspektor (S3)</w:t>
       </w:r>
       <w:r>
@@ -33758,7 +34391,7 @@
           <w:bCs/>
         </w:rPr>
       </w:pPr>
-      <w:bookmarkStart w:id="88" w:name="_Toc243883959"/>
+      <w:bookmarkStart w:id="90" w:name="_Toc243883959"/>
       <w:r>
         <w:rPr>
           <w:rFonts w:ascii="Times New Roman" w:eastAsia="Times New Roman" w:hAnsi="Times New Roman" w:cs="Times New Roman"/>
@@ -33767,7 +34400,7 @@
         </w:rPr>
         <w:t>Prihvatanje sistema i obuka korisnika</w:t>
       </w:r>
-      <w:bookmarkEnd w:id="88"/>
+      <w:bookmarkEnd w:id="90"/>
     </w:p>
     <w:p>
       <w:pPr>
@@ -33823,6 +34456,7 @@
           <w:kern w:val="0"/>
           <w14:ligatures w14:val="none"/>
         </w:rPr>
+        <w:lastRenderedPageBreak/>
         <w:t>Za smanjenje ovog rizika potrebno je osigurati jednostavan i pregledan korisnički interfejs, odgovarajuća korisnička uputstva i praktičnu obuku.</w:t>
       </w:r>
     </w:p>
@@ -33916,17 +34550,16 @@
           <w:bCs/>
         </w:rPr>
       </w:pPr>
-      <w:bookmarkStart w:id="89" w:name="_Toc243883960"/>
+      <w:bookmarkStart w:id="91" w:name="_Toc243883960"/>
       <w:r>
         <w:rPr>
           <w:rFonts w:ascii="Times New Roman" w:eastAsia="Times New Roman" w:hAnsi="Times New Roman" w:cs="Times New Roman"/>
           <w:b/>
           <w:bCs/>
         </w:rPr>
-        <w:lastRenderedPageBreak/>
         <w:t>Operativni rizici i mjere ublažavanja</w:t>
       </w:r>
-      <w:bookmarkEnd w:id="89"/>
+      <w:bookmarkEnd w:id="91"/>
     </w:p>
     <w:tbl>
       <w:tblPr>
@@ -34563,7 +35196,7 @@
           <w14:ligatures w14:val="none"/>
         </w:rPr>
       </w:pPr>
-      <w:bookmarkStart w:id="90" w:name="_Toc243881145"/>
+      <w:bookmarkStart w:id="92" w:name="_Toc243881145"/>
       <w:r>
         <w:rPr>
           <w:rFonts w:ascii="Times New Roman" w:hAnsi="Times New Roman" w:cs="Times New Roman"/>
@@ -34607,7 +35240,7 @@
         </w:rPr>
         <w:t>: Operativni rizici, povezani stakeholderi i predložene mjere ublažavanja</w:t>
       </w:r>
-      <w:bookmarkEnd w:id="90"/>
+      <w:bookmarkEnd w:id="92"/>
     </w:p>
     <w:p>
       <w:pPr>
@@ -34642,16 +35275,17 @@
           <w:bCs/>
         </w:rPr>
       </w:pPr>
-      <w:bookmarkStart w:id="91" w:name="_Toc243883961"/>
+      <w:bookmarkStart w:id="93" w:name="_Toc243883961"/>
       <w:r>
         <w:rPr>
           <w:rFonts w:ascii="Times New Roman" w:eastAsia="Times New Roman" w:hAnsi="Times New Roman" w:cs="Times New Roman"/>
           <w:b/>
           <w:bCs/>
         </w:rPr>
+        <w:lastRenderedPageBreak/>
         <w:t>Zaključna procjena operativne izvedivosti</w:t>
       </w:r>
-      <w:bookmarkEnd w:id="91"/>
+      <w:bookmarkEnd w:id="93"/>
     </w:p>
     <w:p>
       <w:pPr>
@@ -34726,7 +35360,7 @@
           <w:szCs w:val="28"/>
         </w:rPr>
       </w:pPr>
-      <w:bookmarkStart w:id="92" w:name="_Toc243883962"/>
+      <w:bookmarkStart w:id="94" w:name="_Toc243883962"/>
       <w:r>
         <w:rPr>
           <w:rFonts w:ascii="Times New Roman" w:eastAsia="Times New Roman" w:hAnsi="Times New Roman" w:cs="Times New Roman"/>
@@ -34737,7 +35371,7 @@
         </w:rPr>
         <w:t>Analiza organizacijske i pravne izvedivosti</w:t>
       </w:r>
-      <w:bookmarkEnd w:id="92"/>
+      <w:bookmarkEnd w:id="94"/>
     </w:p>
     <w:p>
       <w:pPr>
@@ -34753,7 +35387,7 @@
           <w:bCs/>
         </w:rPr>
       </w:pPr>
-      <w:bookmarkStart w:id="93" w:name="_Toc243883963"/>
+      <w:bookmarkStart w:id="95" w:name="_Toc243883963"/>
       <w:r>
         <w:rPr>
           <w:rFonts w:ascii="Times New Roman" w:eastAsia="Times New Roman" w:hAnsi="Times New Roman" w:cs="Times New Roman"/>
@@ -34762,7 +35396,7 @@
         </w:rPr>
         <w:t>Organizacijska izvedivost</w:t>
       </w:r>
-      <w:bookmarkEnd w:id="93"/>
+      <w:bookmarkEnd w:id="95"/>
     </w:p>
     <w:p>
       <w:pPr>
@@ -34799,103 +35433,111 @@
           <w:kern w:val="0"/>
           <w14:ligatures w14:val="none"/>
         </w:rPr>
+        <w:t>Misija i vizija organizacije, definisane u poglavlju 4, usmjerene su na pružanje pouzdanih tehničkih inspekcija, digitalizaciju poslovanja, unapređenje efikasnosti i primjenu savremenih tehnologija.</w:t>
+      </w:r>
+    </w:p>
+    <w:p>
+      <w:pPr>
+        <w:spacing w:before="100" w:beforeAutospacing="1" w:after="100" w:afterAutospacing="1" w:line="276" w:lineRule="auto"/>
+        <w:jc w:val="both"/>
+        <w:rPr>
+          <w:rFonts w:ascii="Times New Roman" w:eastAsia="Times New Roman" w:hAnsi="Times New Roman" w:cs="Times New Roman"/>
+          <w:kern w:val="0"/>
+          <w14:ligatures w14:val="none"/>
+        </w:rPr>
+      </w:pPr>
+      <w:r>
+        <w:rPr>
+          <w:rFonts w:ascii="Times New Roman" w:eastAsia="Times New Roman" w:hAnsi="Times New Roman" w:cs="Times New Roman"/>
+          <w:kern w:val="0"/>
+          <w14:ligatures w14:val="none"/>
+        </w:rPr>
+        <w:t>Predloženi informacioni sistem neposredno podržava ove ciljeve centralizacijom poslovnih podataka, unapređenjem koordinacije zaposlenih, standardizacijom dokumentacije i korištenjem AI podrške pri preliminarnoj analizi fotografija.</w:t>
+      </w:r>
+    </w:p>
+    <w:p>
+      <w:pPr>
+        <w:spacing w:before="100" w:beforeAutospacing="1" w:after="100" w:afterAutospacing="1" w:line="276" w:lineRule="auto"/>
+        <w:jc w:val="both"/>
+        <w:rPr>
+          <w:rFonts w:ascii="Times New Roman" w:eastAsia="Times New Roman" w:hAnsi="Times New Roman" w:cs="Times New Roman"/>
+          <w:kern w:val="0"/>
+          <w14:ligatures w14:val="none"/>
+        </w:rPr>
+      </w:pPr>
+      <w:r>
+        <w:rPr>
+          <w:rFonts w:ascii="Times New Roman" w:eastAsia="Times New Roman" w:hAnsi="Times New Roman" w:cs="Times New Roman"/>
+          <w:kern w:val="0"/>
+          <w14:ligatures w14:val="none"/>
+        </w:rPr>
+        <w:t>Za realizaciju projekta posebno je važna podrška uprave kompanije (S1), koja bi trebala osigurati organizacijske i finansijske resurse, odobriti ključne odluke i pratiti ostvarivanje očekivanih poslovnih koristi.</w:t>
+      </w:r>
+    </w:p>
+    <w:p>
+      <w:pPr>
+        <w:spacing w:before="100" w:beforeAutospacing="1" w:after="100" w:afterAutospacing="1" w:line="276" w:lineRule="auto"/>
+        <w:jc w:val="both"/>
+        <w:rPr>
+          <w:rFonts w:ascii="Times New Roman" w:eastAsia="Times New Roman" w:hAnsi="Times New Roman" w:cs="Times New Roman"/>
+          <w:kern w:val="0"/>
+          <w14:ligatures w14:val="none"/>
+        </w:rPr>
+      </w:pPr>
+      <w:r>
+        <w:rPr>
+          <w:rFonts w:ascii="Times New Roman" w:eastAsia="Times New Roman" w:hAnsi="Times New Roman" w:cs="Times New Roman"/>
+          <w:kern w:val="0"/>
+          <w14:ligatures w14:val="none"/>
+        </w:rPr>
+        <w:t>Koordinator inspekcija (S2) i tehnički inspektor (S3) imaju značajnu ulogu u definisanju poslovnih zahtjeva i provjeri funkcionalnosti koje direktno utiču na svakodnevni rad organizacije.</w:t>
+      </w:r>
+    </w:p>
+    <w:p>
+      <w:pPr>
+        <w:spacing w:before="100" w:beforeAutospacing="1" w:after="100" w:afterAutospacing="1" w:line="276" w:lineRule="auto"/>
+        <w:jc w:val="both"/>
+        <w:rPr>
+          <w:rFonts w:ascii="Times New Roman" w:eastAsia="Times New Roman" w:hAnsi="Times New Roman" w:cs="Times New Roman"/>
+          <w:kern w:val="0"/>
+          <w14:ligatures w14:val="none"/>
+        </w:rPr>
+      </w:pPr>
+      <w:r>
+        <w:rPr>
+          <w:rFonts w:ascii="Times New Roman" w:eastAsia="Times New Roman" w:hAnsi="Times New Roman" w:cs="Times New Roman"/>
+          <w:kern w:val="0"/>
+          <w14:ligatures w14:val="none"/>
+        </w:rPr>
+        <w:t>Projektni menadžer i razvojni tim (S6) odgovorni su za realizaciju predloženog tehničkog rješenja, dok administrator sistema (S5) ima važnu ulogu u upravljanju korisničkim računima i sigurnosnim postavkama.</w:t>
+      </w:r>
+    </w:p>
+    <w:p>
+      <w:pPr>
+        <w:spacing w:before="100" w:beforeAutospacing="1" w:after="100" w:afterAutospacing="1" w:line="276" w:lineRule="auto"/>
+        <w:jc w:val="both"/>
+        <w:rPr>
+          <w:rFonts w:ascii="Times New Roman" w:eastAsia="Times New Roman" w:hAnsi="Times New Roman" w:cs="Times New Roman"/>
+          <w:kern w:val="0"/>
+          <w14:ligatures w14:val="none"/>
+        </w:rPr>
+      </w:pPr>
+      <w:r>
+        <w:rPr>
+          <w:rFonts w:ascii="Times New Roman" w:eastAsia="Times New Roman" w:hAnsi="Times New Roman" w:cs="Times New Roman"/>
+          <w:kern w:val="0"/>
+          <w14:ligatures w14:val="none"/>
+        </w:rPr>
+        <w:t xml:space="preserve">Predloženi sistem ne zahtijeva promjenu osnovne djelatnosti kompanije niti formiranje potpuno nove organizacijske strukture. Međutim, potrebno je jasno definisati odgovornosti za unos i </w:t>
+      </w:r>
+      <w:r>
+        <w:rPr>
+          <w:rFonts w:ascii="Times New Roman" w:eastAsia="Times New Roman" w:hAnsi="Times New Roman" w:cs="Times New Roman"/>
+          <w:kern w:val="0"/>
+          <w14:ligatures w14:val="none"/>
+        </w:rPr>
         <w:lastRenderedPageBreak/>
-        <w:t>Misija i vizija organizacije, definisane u poglavlju 4, usmjerene su na pružanje pouzdanih tehničkih inspekcija, digitalizaciju poslovanja, unapređenje efikasnosti i primjenu savremenih tehnologija.</w:t>
-      </w:r>
-    </w:p>
-    <w:p>
-      <w:pPr>
-        <w:spacing w:before="100" w:beforeAutospacing="1" w:after="100" w:afterAutospacing="1" w:line="276" w:lineRule="auto"/>
-        <w:jc w:val="both"/>
-        <w:rPr>
-          <w:rFonts w:ascii="Times New Roman" w:eastAsia="Times New Roman" w:hAnsi="Times New Roman" w:cs="Times New Roman"/>
-          <w:kern w:val="0"/>
-          <w14:ligatures w14:val="none"/>
-        </w:rPr>
-      </w:pPr>
-      <w:r>
-        <w:rPr>
-          <w:rFonts w:ascii="Times New Roman" w:eastAsia="Times New Roman" w:hAnsi="Times New Roman" w:cs="Times New Roman"/>
-          <w:kern w:val="0"/>
-          <w14:ligatures w14:val="none"/>
-        </w:rPr>
-        <w:t>Predloženi informacioni sistem neposredno podržava ove ciljeve centralizacijom poslovnih podataka, unapređenjem koordinacije zaposlenih, standardizacijom dokumentacije i korištenjem AI podrške pri preliminarnoj analizi fotografija.</w:t>
-      </w:r>
-    </w:p>
-    <w:p>
-      <w:pPr>
-        <w:spacing w:before="100" w:beforeAutospacing="1" w:after="100" w:afterAutospacing="1" w:line="276" w:lineRule="auto"/>
-        <w:jc w:val="both"/>
-        <w:rPr>
-          <w:rFonts w:ascii="Times New Roman" w:eastAsia="Times New Roman" w:hAnsi="Times New Roman" w:cs="Times New Roman"/>
-          <w:kern w:val="0"/>
-          <w14:ligatures w14:val="none"/>
-        </w:rPr>
-      </w:pPr>
-      <w:r>
-        <w:rPr>
-          <w:rFonts w:ascii="Times New Roman" w:eastAsia="Times New Roman" w:hAnsi="Times New Roman" w:cs="Times New Roman"/>
-          <w:kern w:val="0"/>
-          <w14:ligatures w14:val="none"/>
-        </w:rPr>
-        <w:t>Za realizaciju projekta posebno je važna podrška uprave kompanije (S1), koja bi trebala osigurati organizacijske i finansijske resurse, odobriti ključne odluke i pratiti ostvarivanje očekivanih poslovnih koristi.</w:t>
-      </w:r>
-    </w:p>
-    <w:p>
-      <w:pPr>
-        <w:spacing w:before="100" w:beforeAutospacing="1" w:after="100" w:afterAutospacing="1" w:line="276" w:lineRule="auto"/>
-        <w:jc w:val="both"/>
-        <w:rPr>
-          <w:rFonts w:ascii="Times New Roman" w:eastAsia="Times New Roman" w:hAnsi="Times New Roman" w:cs="Times New Roman"/>
-          <w:kern w:val="0"/>
-          <w14:ligatures w14:val="none"/>
-        </w:rPr>
-      </w:pPr>
-      <w:r>
-        <w:rPr>
-          <w:rFonts w:ascii="Times New Roman" w:eastAsia="Times New Roman" w:hAnsi="Times New Roman" w:cs="Times New Roman"/>
-          <w:kern w:val="0"/>
-          <w14:ligatures w14:val="none"/>
-        </w:rPr>
-        <w:t>Koordinator inspekcija (S2) i tehnički inspektor (S3) imaju značajnu ulogu u definisanju poslovnih zahtjeva i provjeri funkcionalnosti koje direktno utiču na svakodnevni rad organizacije.</w:t>
-      </w:r>
-    </w:p>
-    <w:p>
-      <w:pPr>
-        <w:spacing w:before="100" w:beforeAutospacing="1" w:after="100" w:afterAutospacing="1" w:line="276" w:lineRule="auto"/>
-        <w:jc w:val="both"/>
-        <w:rPr>
-          <w:rFonts w:ascii="Times New Roman" w:eastAsia="Times New Roman" w:hAnsi="Times New Roman" w:cs="Times New Roman"/>
-          <w:kern w:val="0"/>
-          <w14:ligatures w14:val="none"/>
-        </w:rPr>
-      </w:pPr>
-      <w:r>
-        <w:rPr>
-          <w:rFonts w:ascii="Times New Roman" w:eastAsia="Times New Roman" w:hAnsi="Times New Roman" w:cs="Times New Roman"/>
-          <w:kern w:val="0"/>
-          <w14:ligatures w14:val="none"/>
-        </w:rPr>
-        <w:t>Projektni menadžer i razvojni tim (S6) odgovorni su za realizaciju predloženog tehničkog rješenja, dok administrator sistema (S5) ima važnu ulogu u upravljanju korisničkim računima i sigurnosnim postavkama.</w:t>
-      </w:r>
-    </w:p>
-    <w:p>
-      <w:pPr>
-        <w:spacing w:before="100" w:beforeAutospacing="1" w:after="100" w:afterAutospacing="1" w:line="276" w:lineRule="auto"/>
-        <w:jc w:val="both"/>
-        <w:rPr>
-          <w:rFonts w:ascii="Times New Roman" w:eastAsia="Times New Roman" w:hAnsi="Times New Roman" w:cs="Times New Roman"/>
-          <w:kern w:val="0"/>
-          <w14:ligatures w14:val="none"/>
-        </w:rPr>
-      </w:pPr>
-      <w:r>
-        <w:rPr>
-          <w:rFonts w:ascii="Times New Roman" w:eastAsia="Times New Roman" w:hAnsi="Times New Roman" w:cs="Times New Roman"/>
-          <w:kern w:val="0"/>
-          <w14:ligatures w14:val="none"/>
-        </w:rPr>
-        <w:t>Predloženi sistem ne zahtijeva promjenu osnovne djelatnosti kompanije niti formiranje potpuno nove organizacijske strukture. Međutim, potrebno je jasno definisati odgovornosti za unos i ažuriranje podataka, dodjeljivanje zadataka, potvrđivanje tehničkih nalaza, objavljivanje izvještaja i održavanje sistema.</w:t>
+        <w:t>ažuriranje podataka, dodjeljivanje zadataka, potvrđivanje tehničkih nalaza, objavljivanje izvještaja i održavanje sistema.</w:t>
       </w:r>
     </w:p>
     <w:p>
@@ -34988,7 +35630,7 @@
           <w:bCs/>
         </w:rPr>
       </w:pPr>
-      <w:bookmarkStart w:id="94" w:name="_Toc243883964"/>
+      <w:bookmarkStart w:id="96" w:name="_Toc243883964"/>
       <w:r>
         <w:rPr>
           <w:rFonts w:ascii="Times New Roman" w:eastAsia="Times New Roman" w:hAnsi="Times New Roman" w:cs="Times New Roman"/>
@@ -34997,7 +35639,7 @@
         </w:rPr>
         <w:t>Pravna izvedivost i sigurnosna ograničenja</w:t>
       </w:r>
-      <w:bookmarkEnd w:id="94"/>
+      <w:bookmarkEnd w:id="96"/>
     </w:p>
     <w:p>
       <w:pPr>
@@ -35034,7 +35676,6 @@
           <w:kern w:val="0"/>
           <w14:ligatures w14:val="none"/>
         </w:rPr>
-        <w:lastRenderedPageBreak/>
         <w:t>Posebno su značajni zaštita ličnih podataka, upravljanje prikupljenim fotografijama i videozapisima, korištenje vanjskih tehnoloških servisa i propisi koji uređuju izvođenje letačkih operacija dronovima.</w:t>
       </w:r>
     </w:p>
@@ -35167,6 +35808,7 @@
           <w:kern w:val="0"/>
           <w14:ligatures w14:val="none"/>
         </w:rPr>
+        <w:lastRenderedPageBreak/>
         <w:t>Također je potrebno definisati pravila čuvanja i eventualnog brisanja podataka, postupanje sa sigurnosnim kopijama i odgovarajuću evidenciju važnih aktivnosti.</w:t>
       </w:r>
     </w:p>
@@ -35339,7 +35981,6 @@
           <w:kern w:val="0"/>
           <w14:ligatures w14:val="none"/>
         </w:rPr>
-        <w:lastRenderedPageBreak/>
         <w:t>Prije izvođenja konkretne inspekcije kompanija i odgovarajući operater dužni su provjeriti uslove i ograničenja koja se odnose na planiranu letačku operaciju, kao i potrebna odobrenja kada su propisana.</w:t>
       </w:r>
     </w:p>
@@ -35456,6 +36097,7 @@
           <w:kern w:val="0"/>
           <w14:ligatures w14:val="none"/>
         </w:rPr>
+        <w:lastRenderedPageBreak/>
         <w:t>Ovakvo razgraničenje odgovornosti značajno je za smanjenje rizika od nekritičkog oslanjanja na automatski generisane rezultate.</w:t>
       </w:r>
     </w:p>
@@ -35553,7 +36195,7 @@
           <w:szCs w:val="28"/>
         </w:rPr>
       </w:pPr>
-      <w:bookmarkStart w:id="95" w:name="_Toc243883965"/>
+      <w:bookmarkStart w:id="97" w:name="_Toc243883965"/>
       <w:r>
         <w:rPr>
           <w:rFonts w:ascii="Times New Roman" w:eastAsia="Times New Roman" w:hAnsi="Times New Roman" w:cs="Times New Roman"/>
@@ -35564,7 +36206,7 @@
         </w:rPr>
         <w:t>Zaključna procjena izvedivosti projekta</w:t>
       </w:r>
-      <w:bookmarkEnd w:id="95"/>
+      <w:bookmarkEnd w:id="97"/>
     </w:p>
     <w:p>
       <w:pPr>
@@ -35611,16 +36253,7 @@
           <w:kern w:val="0"/>
           <w14:ligatures w14:val="none"/>
         </w:rPr>
-        <w:t xml:space="preserve"> Osnovne funkcionalnosti sistema moguće je realizovati korištenjem postojećih tehnologija za razvoj web aplikacija, upravljanje bazama podataka i pohranu </w:t>
-      </w:r>
-      <w:r>
-        <w:rPr>
-          <w:rFonts w:ascii="Times New Roman" w:eastAsia="Times New Roman" w:hAnsi="Times New Roman" w:cs="Times New Roman"/>
-          <w:kern w:val="0"/>
-          <w14:ligatures w14:val="none"/>
-        </w:rPr>
-        <w:lastRenderedPageBreak/>
-        <w:t>multimedijalnog sadržaja. Najznačajniji tehnički izazov predstavlja integracija i provjera pouzdanosti AI komponente.</w:t>
+        <w:t xml:space="preserve"> Osnovne funkcionalnosti sistema moguće je realizovati korištenjem postojećih tehnologija za razvoj web aplikacija, upravljanje bazama podataka i pohranu multimedijalnog sadržaja. Najznačajniji tehnički izazov predstavlja integracija i provjera pouzdanosti AI komponente.</w:t>
       </w:r>
     </w:p>
     <w:p>
@@ -35757,6 +36390,7 @@
           <w:kern w:val="0"/>
           <w14:ligatures w14:val="none"/>
         </w:rPr>
+        <w:lastRenderedPageBreak/>
         <w:t>Pravna izvedivost:</w:t>
       </w:r>
       <w:r>
@@ -35879,7 +36513,7 @@
       </w:pPr>
     </w:p>
     <w:sectPr>
-      <w:footerReference w:type="default" r:id="rId10"/>
+      <w:footerReference w:type="default" r:id="rId12"/>
       <w:pgSz w:w="12240" w:h="15840"/>
       <w:pgMar w:top="1440" w:right="1440" w:bottom="1440" w:left="1440" w:header="720" w:footer="720" w:gutter="0"/>
       <w:pgNumType w:start="1"/>
@@ -35919,7 +36553,7 @@
 <w:ftr xmlns:wpc="http://schemas.microsoft.com/office/word/2010/wordprocessingCanvas" xmlns:cx="http://schemas.microsoft.com/office/drawing/2014/chartex" xmlns:cx1="http://schemas.microsoft.com/office/drawing/2015/9/8/chartex" xmlns:cx2="http://schemas.microsoft.com/office/drawing/2015/10/21/chartex" xmlns:cx3="http://schemas.microsoft.com/office/drawing/2016/5/9/chartex" xmlns:cx4="http://schemas.microsoft.com/office/drawing/2016/5/10/chartex" xmlns:cx5="http://schemas.microsoft.com/office/drawing/2016/5/11/chartex" xmlns:cx6="http://schemas.microsoft.com/office/drawing/2016/5/12/chartex" xmlns:cx7="http://schemas.microsoft.com/office/drawing/2016/5/13/chartex" xmlns:cx8="http://schemas.microsoft.com/office/drawing/2016/5/14/chartex" xmlns:mc="http://schemas.openxmlformats.org/markup-compatibility/2006" xmlns:aink="http://schemas.microsoft.com/office/drawing/2016/ink" xmlns:am3d="http://schemas.microsoft.com/office/drawing/2017/model3d" xmlns:o="urn:schemas-microsoft-com:office:office" xmlns:oel="http://schemas.microsoft.com/office/2019/extlst" xmlns:r="http://schemas.openxmlformats.org/officeDocument/2006/relationships" xmlns:m="http://schemas.openxmlformats.org/officeDocument/2006/math" xmlns:v="urn:schemas-microsoft-com:vml" xmlns:wp14="http://schemas.microsoft.com/office/word/2010/wordprocessingDrawing" xmlns:wp="http://schemas.openxmlformats.org/drawingml/2006/wordprocessingDrawing" xmlns:w10="urn:schemas-microsoft-com:office:word" xmlns:w="http://schemas.openxmlformats.org/wordprocessingml/2006/main" xmlns:w14="http://schemas.microsoft.com/office/word/2010/wordml" xmlns:w15="http://schemas.microsoft.com/office/word/2012/wordml" xmlns:w16cex="http://schemas.microsoft.com/office/word/2018/wordml/cex" xmlns:w16cid="http://schemas.microsoft.com/office/word/2016/wordml/cid" xmlns:w16="http://schemas.microsoft.com/office/word/2018/wordml" xmlns:w16du="http://schemas.microsoft.com/office/word/2023/wordml/word16du" xmlns:w16sdtdh="http://schemas.microsoft.com/office/word/2020/wordml/sdtdatahash" xmlns:w16sdtfl="http://schemas.microsoft.com/office/word/2024/wordml/sdtformatlock" xmlns:w16se="http://schemas.microsoft.com/office/word/2015/wordml/symex" xmlns:wpg="http://schemas.microsoft.com/office/word/2010/wordprocessingGroup" xmlns:wpi="http://schemas.microsoft.com/office/word/2010/wordprocessingInk" xmlns:wne="http://schemas.microsoft.com/office/word/2006/wordml" xmlns:wps="http://schemas.microsoft.com/office/word/2010/wordprocessingShape" mc:Ignorable="w14 w15 w16se w16cid w16 w16cex w16sdtdh w16sdtfl w16du wp14">
   <w:sdt>
     <w:sdtPr>
-      <w:id w:val="-1957551406"/>
+      <w:id w:val="301580004"/>
       <w:docPartObj>
         <w:docPartGallery w:val="Page Numbers (Bottom of Page)"/>
         <w:docPartUnique/>
@@ -35927,6 +36561,7 @@
     </w:sdtPr>
     <w:sdtEndPr>
       <w:rPr>
+        <w:rFonts w:ascii="Times New Roman" w:hAnsi="Times New Roman" w:cs="Times New Roman"/>
         <w:noProof/>
       </w:rPr>
     </w:sdtEndPr>
@@ -35935,24 +36570,38 @@
         <w:pPr>
           <w:pStyle w:val="Footer"/>
           <w:jc w:val="right"/>
+          <w:rPr>
+            <w:rFonts w:ascii="Times New Roman" w:hAnsi="Times New Roman" w:cs="Times New Roman"/>
+          </w:rPr>
         </w:pPr>
         <w:r>
+          <w:rPr>
+            <w:rFonts w:ascii="Times New Roman" w:hAnsi="Times New Roman" w:cs="Times New Roman"/>
+          </w:rPr>
           <w:fldChar w:fldCharType="begin"/>
         </w:r>
         <w:r>
+          <w:rPr>
+            <w:rFonts w:ascii="Times New Roman" w:hAnsi="Times New Roman" w:cs="Times New Roman"/>
+          </w:rPr>
           <w:instrText xml:space="preserve"> PAGE   \* MERGEFORMAT </w:instrText>
         </w:r>
         <w:r>
+          <w:rPr>
+            <w:rFonts w:ascii="Times New Roman" w:hAnsi="Times New Roman" w:cs="Times New Roman"/>
+          </w:rPr>
           <w:fldChar w:fldCharType="separate"/>
         </w:r>
         <w:r>
           <w:rPr>
+            <w:rFonts w:ascii="Times New Roman" w:hAnsi="Times New Roman" w:cs="Times New Roman"/>
             <w:noProof/>
           </w:rPr>
           <w:t>2</w:t>
         </w:r>
         <w:r>
           <w:rPr>
+            <w:rFonts w:ascii="Times New Roman" w:hAnsi="Times New Roman" w:cs="Times New Roman"/>
             <w:noProof/>
           </w:rPr>
           <w:fldChar w:fldCharType="end"/>

</xml_diff>